<commit_message>
Revise Chapter 7 through two more review rounds to 5/5
The expert and literary reviewers re-read the chapter after each round
of fixes. Scores went from 4 to 4.5 to 5 (expert), and from 4 to 4 to 5
for prose with reader interest at 5 (literary). Added: human tests of
the James-Lange theory, sustained anxiety and the bed nucleus of the
stria terminalis, early-life setting of the stress axis, the two
cortisol receptors, social buffering, and the vagal route for
adrenaline's effect on memory. Tightened the prose, fixed the seams the
cuts left, aligned the companion, and logged all 110 citations.

Co-Authored-By: Claude Opus 5.5 <noreply@anthropic.com>
</commit_message>
<xml_diff>
--- a/docs/book/Word/Chapter7/How_the_Brain_Learns_Chapter_7_Emotion_and_the_Body.docx
+++ b/docs/book/Word/Chapter7/How_the_Brain_Learns_Chapter_7_Emotion_and_the_Body.docx
@@ -198,15 +198,15 @@
         <w:pStyle w:val="FirstParagraph"/>
       </w:pPr>
       <w:r>
-        <w:t xml:space="preserve">Chapter 6 ended with a brain that builds its best current hypothesis about the world from noisy evidence and learned expectation. That brain can tell a bump from a dent and a face from a mask, but nothing in the machinery of the last chapter says whether the face belongs to a friend or a threat, or whether the bump is worth reaching for. A model of the world is not yet a reason to do anything. Perception answers the question of what is out there. It does not answer the question every animal must answer next, which is whether what is out there matters, and how much.</w:t>
-      </w:r>
-    </w:p>
-    <w:p>
-      <w:pPr>
-        <w:pStyle w:val="BodyText"/>
-      </w:pPr>
-      <w:r>
-        <w:t xml:space="preserve">The answer has to come from the one thing the brain is built to protect, the body that carries it. Food matters to a hungry animal and not to a sated one, and a stranger matters more at night than at noon, because value is relative to the state of the body and its prospects. The brain therefore needs a second model alongside its model of the world: a model of the body itself, of how it stands now and where it is heading. Chapter 1 described the brain as a controller whose job is to keep a set of internal variables within bounds. This chapter takes that description literally.</w:t>
+        <w:t xml:space="preserve">Chapter 6 ended with a brain that builds its best current hypothesis about the world from noisy evidence and learned expectation. That brain can tell a face from a mask, but nothing in its machinery says whether the face belongs to a friend or a threat. A model of the world is not yet a reason to do anything. Perception answers the question of what is out there. It does not answer the question every animal must answer next, which is whether what is out there matters, and how much.</w:t>
+      </w:r>
+    </w:p>
+    <w:p>
+      <w:pPr>
+        <w:pStyle w:val="BodyText"/>
+      </w:pPr>
+      <w:r>
+        <w:t xml:space="preserve">The answer has to come from the one thing the brain is built to protect, the body that carries it. Food matters to a hungry animal and not to a sated one, and a stranger matters more at night than at noon, because value is relative to the state of the body and its prospects. The brain therefore needs a second model alongside its model of the world: a model of the body itself, of how it stands now and where it is heading. Chapter 1 described the brain as a controller that keeps a body’s internal variables within bounds; this chapter takes the description literally.</w:t>
       </w:r>
     </w:p>
     <w:p>
@@ -291,7 +291,7 @@
         <w:pStyle w:val="BodyText"/>
       </w:pPr>
       <w:r>
-        <w:t xml:space="preserve">The hub of those loops in the brain is the hypothalamus, a structure of about four grams at the base of the forebrain. Its neurons sense blood temperature, glucose, and osmolarity (the concentration of salts and other solutes), and it receives signals from the gut, the heart, and the immune system. It corrects through three channels: the autonomic nervous system, whose sympathetic and parasympathetic branches speed and slow the heart, widen and narrow blood vessels, and start and stop digestion; the pituitary gland, which controls the hormones of stress, growth, reproduction, and water balance; and behavior, by making the animal hungry, thirsty, or cold enough to fix the problem itself.</w:t>
+        <w:t xml:space="preserve">The hub of those loops in the brain is the hypothalamus, a structure of about four grams at the base of the forebrain. Its neurons sense blood temperature, glucose, and osmolarity (the concentration of salts and other solutes), and it receives signals from the gut, the heart, and the immune system. It corrects through three channels: the autonomic nervous system, whose sympathetic and parasympathetic branches speed and slow the heart, the blood vessels, and digestion; the pituitary gland, which controls the hormones of stress, growth, reproduction, and water balance; and behavior, by making the animal hungry, thirsty, or cold enough to fix the problem itself.</w:t>
       </w:r>
       <w:r>
         <w:rPr>
@@ -305,7 +305,7 @@
         <w:pStyle w:val="BodyText"/>
       </w:pPr>
       <w:r>
-        <w:t xml:space="preserve">That third channel is where regulation becomes emotion. In the 1920s Cannon and Sydney Britton found that cats whose cerebral cortex had been removed flew into fits of rage at the slightest touch, and named the display sham rage, because it looked like anger without any sign of an object.</w:t>
+        <w:t xml:space="preserve">That third channel is where regulation becomes emotion. In the 1920s Cannon and Sydney Britton found that cats whose cerebral cortex had been removed flew into fits of rage at the slightest touch, hissing, their hearts racing. They named the display sham rage, because it looked like anger without any sign of an object.</w:t>
       </w:r>
       <w:r>
         <w:rPr>
@@ -317,7 +317,7 @@
         <w:t xml:space="preserve"> </w:t>
       </w:r>
       <w:r>
-        <w:t xml:space="preserve">In 1928 Philip Bard showed that the display, hissing and racing heart included, disappeared only when the posterior hypothalamus was removed as well.</w:t>
+        <w:t xml:space="preserve">In 1928 Philip Bard showed that the display disappeared only when the posterior hypothalamus was removed as well.</w:t>
       </w:r>
       <w:r>
         <w:rPr>
@@ -329,7 +329,7 @@
         <w:t xml:space="preserve"> </w:t>
       </w:r>
       <w:r>
-        <w:t xml:space="preserve">Eighty years later David Anderson’s laboratory found a small population of neurons in the ventromedial hypothalamus of male mice that, when stimulated with light, made the animal attack whatever was in front of it, including a female or an inflated rubber glove.</w:t>
+        <w:t xml:space="preserve">More than 80 years later David Anderson’s laboratory found a small population of neurons in the ventromedial hypothalamus of male mice that, when stimulated with light, made the animal attack whatever was in front of it, including a female or an inflated rubber glove.</w:t>
       </w:r>
       <w:r>
         <w:rPr>
@@ -359,7 +359,7 @@
         <w:pStyle w:val="FirstParagraph"/>
       </w:pPr>
       <w:r>
-        <w:t xml:space="preserve">A thermostat waits for the room to get cold. Much of the body’s regulation works the same way: when you stand up, the baroreflex detects the fall in blood pressure and corrects it within a heartbeat or two. But the body also regulates ahead of need. If you start to run, your muscles’ demand for oxygen rises within seconds. In 1913 August Krogh and Johannes Lindhard showed that heart rate and breathing rise within a second or two of the start of exercise, sooner than any chemical change in the blood could signal the need.</w:t>
+        <w:t xml:space="preserve">A thermostat waits for the room to get cold. Much of the body’s regulation works the same way: when you stand up, a reflex driven by pressure sensors in the great arteries, the baroreflex, detects the fall in blood pressure and corrects it within a heartbeat or two. But the body also regulates ahead of need. In 1913 August Krogh and Johannes Lindhard showed that heart rate and breathing rise within a second or two of the start of exercise, sooner than any chemical change in the blood could signal the need.</w:t>
       </w:r>
       <w:r>
         <w:rPr>
@@ -379,7 +379,7 @@
         <w:pStyle w:val="BodyText"/>
       </w:pPr>
       <w:r>
-        <w:t xml:space="preserve">In 1988 Peter Sterling and Joseph Eyer gave this predictive kind of regulation a name. They called it allostasis, stability through change: the brain anticipates what the body will need and adjusts its physiology in advance, rather than waiting for an error and correcting it.</w:t>
+        <w:t xml:space="preserve">In 1988 Peter Sterling and Joseph Eyer called this predictive regulation allostasis, stability through change: the brain anticipates what the body will need and adjusts its physiology in advance, rather than waiting for an error and correcting it.</w:t>
       </w:r>
       <w:r>
         <w:rPr>
@@ -506,7 +506,7 @@
         <w:pStyle w:val="BodyText"/>
       </w:pPr>
       <w:r>
-        <w:t xml:space="preserve">Prediction has a cost when the prediction is wrong, and the clearest demonstration is a grim one. Shepard Siegel gave rats a series of heroin injections in one room and then a large test dose either in the same room or in a different one. Of rats that had never had heroin, 96 percent died. Of experienced rats tested in the familiar room, 32 percent died; of experienced rats tested in an unfamiliar room, 64 percent did.</w:t>
+        <w:t xml:space="preserve">Prediction has a cost when it fails, and the clearest demonstration is a grim one. Shepard Siegel gave rats a series of heroin injections in one room and then a large test dose in the same room or a different one. Of rats that had never had heroin, 96 percent died; of experienced rats, 32 percent died in the familiar room and 64 percent in an unfamiliar one.</w:t>
       </w:r>
       <w:r>
         <w:rPr>
@@ -518,7 +518,7 @@
         <w:t xml:space="preserve"> </w:t>
       </w:r>
       <w:r>
-        <w:t xml:space="preserve">Part of what is called tolerance is a learned anticipatory response: the familiar cues tell the body that the drug is coming, and it braces for it, and when the cues are missing the body is unprepared.</w:t>
+        <w:t xml:space="preserve">Part of tolerance is learned anticipation: familiar cues tell the body the drug is coming, and without them the body is unprepared, which is thought to contribute to overdoses in people who take a familiar dose in an unfamiliar place.</w:t>
       </w:r>
     </w:p>
     <w:bookmarkEnd w:id="38"/>
@@ -536,7 +536,7 @@
         <w:pStyle w:val="FirstParagraph"/>
       </w:pPr>
       <w:r>
-        <w:t xml:space="preserve">A controller needs measurements, and the body supplies them through a sensory system that receives far less attention than vision or hearing. Charles Sherrington called the senses that monitor the viscera interoceptive in 1906.</w:t>
+        <w:t xml:space="preserve">A controller needs measurements, and the body supplies them through a sense that receives far less attention than vision or hearing. Charles Sherrington called the senses of the viscera interoceptive in 1906,</w:t>
       </w:r>
       <w:r>
         <w:rPr>
@@ -548,7 +548,7 @@
         <w:t xml:space="preserve"> </w:t>
       </w:r>
       <w:r>
-        <w:t xml:space="preserve">The word is now used for the sensing of the physiological condition of the whole body: heartbeat, blood pressure, breathing, stretch of the stomach and bladder, temperature, the chemistry of the blood, inflammation, itch, and pain.</w:t>
+        <w:t xml:space="preserve">and the word now covers the sensing of the whole body’s condition: heartbeat, breathing, stretch of the stomach and bladder, temperature, blood chemistry, inflammation, itch, and pain.</w:t>
       </w:r>
       <w:r>
         <w:rPr>
@@ -574,7 +574,7 @@
         <w:t xml:space="preserve"> </w:t>
       </w:r>
       <w:r>
-        <w:t xml:space="preserve">Its afferents end in the nucleus of the solitary tract in the brainstem. A second route runs through the spinal cord, where thin fibers from the tissues of the body end in the dorsal horn, many of them in its most superficial layer, lamina I. A third bypasses nerves altogether: at a few small sites where the blood-brain barrier is leaky, called circumventricular organs, the brain samples the blood directly. These streams pass through relays in the brainstem and thalamus, feeding the hypothalamus and amygdala on the way.</w:t>
+        <w:t xml:space="preserve">Its sensory fibers end in the nucleus of the solitary tract in the brainstem. A second route runs through the spinal cord, where thin fibers from the tissues of the body end in the dorsal horn, many of them in its most superficial layer, lamina I. A third bypasses nerves altogether: at a few small sites where the blood-brain barrier is leaky, called circumventricular organs, the brain samples the blood directly. These streams pass through relays in the brainstem and thalamus, feeding the hypothalamus and amygdala on the way.</w:t>
       </w:r>
     </w:p>
     <w:p>
@@ -600,7 +600,7 @@
           <wp:inline>
             <wp:extent cx="5943600" cy="3682092"/>
             <wp:effectExtent b="0" l="0" r="0" t="0"/>
-            <wp:docPr descr="Figure 7.2. The interoceptive pathways. Signals from the viscera travel in the vagus nerve to the nucleus of the solitary tract, signals from the body’s tissues travel through the spinal cord, and blood-borne signals are sampled where the blood-brain barrier is leaky. Relays in the brainstem and thalamus feed the hypothalamus and amygdala and the posterior insula, and the map is elaborated toward the anterior insula." title="" id="44" name="Picture"/>
+            <wp:docPr descr="Figure 7.2. The interoceptive pathways. Signals from the body reach the brain through the vagus nerve, the spinal cord, and sites where the blood-brain barrier is leaky, and are relayed to the hypothalamus, the amygdala, and the insula." title="" id="44" name="Picture"/>
             <a:graphic>
               <a:graphicData uri="http://schemas.openxmlformats.org/drawingml/2006/picture">
                 <pic:pic>
@@ -643,15 +643,15 @@
         <w:pStyle w:val="ImageCaption"/>
       </w:pPr>
       <w:r>
-        <w:t xml:space="preserve">Figure 7.2. The interoceptive pathways. Signals from the viscera travel in the vagus nerve to the nucleus of the solitary tract, signals from the body’s tissues travel through the spinal cord, and blood-borne signals are sampled where the blood-brain barrier is leaky. Relays in the brainstem and thalamus feed the hypothalamus and amygdala and the posterior insula, and the map is elaborated toward the anterior insula.</w:t>
-      </w:r>
-    </w:p>
-    <w:p>
-      <w:pPr>
-        <w:pStyle w:val="BodyText"/>
-      </w:pPr>
-      <w:r>
-        <w:t xml:space="preserve">How well people sense their own bodies can be measured, and it varies widely. In the heartbeat counting task devised by Rainer Schandry, participants silently count their heartbeats over a short interval without touching their pulse, and their count is compared with the true one; some people are nearly exact and others miss half their beats.</w:t>
+        <w:t xml:space="preserve">Figure 7.2. The interoceptive pathways. Signals from the body reach the brain through the vagus nerve, the spinal cord, and sites where the blood-brain barrier is leaky, and are relayed to the hypothalamus, the amygdala, and the insula.</w:t>
+      </w:r>
+    </w:p>
+    <w:p>
+      <w:pPr>
+        <w:pStyle w:val="BodyText"/>
+      </w:pPr>
+      <w:r>
+        <w:t xml:space="preserve">How well people sense their own bodies can be measured, and it varies widely. In the heartbeat counting task devised by Rainer Schandry, participants silently count their heartbeats over a short interval without touching their pulse; some are nearly exact and others miss half their beats.</w:t>
       </w:r>
       <w:r>
         <w:rPr>
@@ -675,7 +675,7 @@
         <w:t xml:space="preserve"> </w:t>
       </w:r>
       <w:r>
-        <w:t xml:space="preserve">The measures are imperfect, since counting can be done partly by estimating time, and accuracy, confidence, and the match between them need not agree.</w:t>
+        <w:t xml:space="preserve">The measures are imperfect, since counting can be done partly by estimating time, and accuracy and confidence need not agree.</w:t>
       </w:r>
       <w:r>
         <w:rPr>
@@ -689,7 +689,7 @@
         <w:pStyle w:val="BodyText"/>
       </w:pPr>
       <w:r>
-        <w:t xml:space="preserve">Interoception carries chemistry as well as mechanics. When the body fights an infection, immune cells release signaling proteins called cytokines that reach the brain through the vagus nerve and through the circumventricular organs. The result is sickness behavior: fatigue, loss of appetite, loss of interest in pleasure, withdrawal from company, and a lowered threshold for pain.</w:t>
+        <w:t xml:space="preserve">Interoception carries chemistry as well as mechanics. When the body fights an infection, immune cells release signaling proteins called cytokines that reach the brain through the vagus nerve and through the circumventricular organs. The result is sickness behavior: fatigue, loss of appetite and of pleasure, withdrawal from company, and heightened pain.</w:t>
       </w:r>
       <w:r>
         <w:rPr>
@@ -713,7 +713,7 @@
         <w:t xml:space="preserve"> </w:t>
       </w:r>
       <w:r>
-        <w:t xml:space="preserve">Signals from the body do not only report a state; they reset the priorities of the whole animal.</w:t>
+        <w:t xml:space="preserve">Body signals do not only report a state; they reset the animal’s priorities.</w:t>
       </w:r>
     </w:p>
     <w:p>
@@ -741,7 +741,7 @@
         <w:pStyle w:val="BodyText"/>
       </w:pPr>
       <w:r>
-        <w:t xml:space="preserve">Anil Seth and, separately, Lisa Feldman Barrett and Kyle Simmons have extended the predictive coding account of Chapter 6 to interoception. On their view, regions of the brain that regulate the body continuously issue predictions of its state, and the insula compares those predictions with the signals arriving from the viscera, so that what is felt is the brain’s best estimate rather than a direct reading.</w:t>
+        <w:t xml:space="preserve">Anil Seth and, separately, Lisa Feldman Barrett and Kyle Simmons have extended the predictive coding account of Chapter 6 to interoception. On their view, regions that regulate the body continuously predict its state, and the insula compares the predictions with the signals arriving from the viscera, so that what is felt is the brain’s best estimate rather than a direct reading.</w:t>
       </w:r>
       <w:r>
         <w:rPr>
@@ -753,7 +753,7 @@
         <w:t xml:space="preserve"> </w:t>
       </w:r>
       <w:r>
-        <w:t xml:space="preserve">The proposal is less tested than its counterpart in vision, but Ian Kleckner and colleagues have traced a network, centered on the cingulate cortex and insula, that both regulates the viscera and hears back from them.</w:t>
+        <w:t xml:space="preserve">The proposal is less tested than its counterpart in vision, though Ian Kleckner and colleagues have traced a cingulate and insular network that both regulates the viscera and hears back from them.</w:t>
       </w:r>
       <w:r>
         <w:rPr>
@@ -763,7 +763,7 @@
       </w:r>
     </w:p>
     <w:bookmarkEnd w:id="54"/>
-    <w:bookmarkStart w:id="71" w:name="what-an-emotion-is"/>
+    <w:bookmarkStart w:id="73" w:name="what-an-emotion-is"/>
     <w:p>
       <w:pPr>
         <w:pStyle w:val="Heading1"/>
@@ -815,7 +815,7 @@
         <w:pStyle w:val="BodyText"/>
       </w:pPr>
       <w:r>
-        <w:t xml:space="preserve">Cannon attacked it in 1927. Cutting the nerves between viscera and brain does not abolish emotional behavior; the same visceral changes accompany different emotions, and fever and exercise as well; the viscera are poorly innervated and slow; and an injection of adrenaline makes people feel as if they were afraid without making them afraid.</w:t>
+        <w:t xml:space="preserve">Cannon attacked it in 1927. Cutting the nerves between viscera and brain does not abolish emotional behavior; the same visceral changes accompany different emotions, and states that are not emotions at all, such as fever and exercise; the viscera are poorly innervated and slow; and an injection of adrenaline, the adrenal hormone that American physiologists call epinephrine and a close chemical relative of Chapter 3’s norepinephrine, makes people feel as if they were afraid without making them afraid.</w:t>
       </w:r>
       <w:r>
         <w:rPr>
@@ -823,12 +823,6 @@
         </w:rPr>
         <w:footnoteReference w:id="56"/>
       </w:r>
-      <w:r>
-        <w:t xml:space="preserve"> </w:t>
-      </w:r>
-      <w:r>
-        <w:t xml:space="preserve">(Adrenaline, which American physiologists call epinephrine, is the hormone of the adrenal gland and a close chemical relative of the norepinephrine of Chapter 3.)</w:t>
-      </w:r>
     </w:p>
     <w:p>
       <w:pPr>
@@ -849,7 +843,7 @@
         <w:pStyle w:val="BodyText"/>
       </w:pPr>
       <w:r>
-        <w:t xml:space="preserve">In people, Garfinkel and colleagues found that fearful faces flashed at the moment the heart contracts are detected more readily and judged more intense than the same faces shown between beats.</w:t>
+        <w:t xml:space="preserve">In people, Sarah Garfinkel and colleagues found that fearful faces flashed at the moment the heart contracts are detected more readily and judged more intense than the same faces shown between beats.</w:t>
       </w:r>
       <w:r>
         <w:rPr>
@@ -861,6 +855,30 @@
         <w:t xml:space="preserve"> </w:t>
       </w:r>
       <w:r>
+        <w:t xml:space="preserve">Tests in people that remove or impose bodily signals have given smaller and less consistent effects. People with high spinal cord injuries, whose brains hear little from the body below the neck, were once reported to feel emotions less intensely, but a better-controlled study found little reduction.</w:t>
+      </w:r>
+      <w:r>
+        <w:rPr>
+          <w:rStyle w:val="FootnoteReference"/>
+        </w:rPr>
+        <w:footnoteReference w:id="59"/>
+      </w:r>
+      <w:r>
+        <w:t xml:space="preserve"> </w:t>
+      </w:r>
+      <w:r>
+        <w:t xml:space="preserve">And the claim that a forced smile makes cartoons funnier failed a replication run in 17 laboratories, although a meta-analysis finds a small effect of facial feedback across many studies.</w:t>
+      </w:r>
+      <w:r>
+        <w:rPr>
+          <w:rStyle w:val="FootnoteReference"/>
+        </w:rPr>
+        <w:footnoteReference w:id="60"/>
+      </w:r>
+      <w:r>
+        <w:t xml:space="preserve"> </w:t>
+      </w:r>
+      <w:r>
         <w:t xml:space="preserve">The body is not the whole of an emotion, but signals from it change both what is felt and what is perceived, and the context decides what they mean.</w:t>
       </w:r>
     </w:p>
@@ -869,13 +887,13 @@
         <w:pStyle w:val="BodyText"/>
       </w:pPr>
       <w:r>
-        <w:t xml:space="preserve">In 1962 Stanley Schachter and Jerome Singer injected volunteers with adrenaline, told some of them what side effects to expect and others nothing, and left each with a confederate who acted either euphoric or angry. The uninformed volunteers, who had no explanation for their racing hearts, tended to take on the mood of the confederate.</w:t>
-      </w:r>
-      <w:r>
-        <w:rPr>
-          <w:rStyle w:val="FootnoteReference"/>
-        </w:rPr>
-        <w:footnoteReference w:id="59"/>
+        <w:t xml:space="preserve">If the body supplies arousal, something else must say what it is about. In 1962 Stanley Schachter and Jerome Singer injected volunteers with adrenaline, told some of them what side effects to expect and others nothing, and left each with a confederate who acted either euphoric or angry. The uninformed volunteers, who had no explanation for their racing hearts, tended to take on the mood of the confederate.</w:t>
+      </w:r>
+      <w:r>
+        <w:rPr>
+          <w:rStyle w:val="FootnoteReference"/>
+        </w:rPr>
+        <w:footnoteReference w:id="61"/>
       </w:r>
       <w:r>
         <w:t xml:space="preserve"> </w:t>
@@ -887,19 +905,19 @@
         <w:rPr>
           <w:rStyle w:val="FootnoteReference"/>
         </w:rPr>
-        <w:footnoteReference w:id="60"/>
-      </w:r>
-      <w:r>
-        <w:t xml:space="preserve"> </w:t>
-      </w:r>
-      <w:r>
-        <w:t xml:space="preserve">But the idea that arousal is interpreted survived. On the Capilano suspension bridge in Vancouver, a swaying span 70 meters above a river, Donald Dutton and Arthur Aron had a female interviewer give men her phone number; half of the men who took the number on the bridge called her, against about one in eight of those interviewed on a low, solid bridge upstream.</w:t>
-      </w:r>
-      <w:r>
-        <w:rPr>
-          <w:rStyle w:val="FootnoteReference"/>
-        </w:rPr>
-        <w:footnoteReference w:id="61"/>
+        <w:footnoteReference w:id="62"/>
+      </w:r>
+      <w:r>
+        <w:t xml:space="preserve"> </w:t>
+      </w:r>
+      <w:r>
+        <w:t xml:space="preserve">But the idea that arousal is interpreted survived. On the Capilano suspension bridge in Vancouver, 70 meters above a river, Donald Dutton and Arthur Aron had a female interviewer give men her phone number; half of the men who took the number on the bridge called her, against about one in eight of those interviewed on a low, solid bridge upstream.</w:t>
+      </w:r>
+      <w:r>
+        <w:rPr>
+          <w:rStyle w:val="FootnoteReference"/>
+        </w:rPr>
+        <w:footnoteReference w:id="63"/>
       </w:r>
     </w:p>
     <w:p>
@@ -913,7 +931,7 @@
         <w:rPr>
           <w:rStyle w:val="FootnoteReference"/>
         </w:rPr>
-        <w:footnoteReference w:id="62"/>
+        <w:footnoteReference w:id="64"/>
       </w:r>
       <w:r>
         <w:t xml:space="preserve"> </w:t>
@@ -925,7 +943,7 @@
         <w:rPr>
           <w:rStyle w:val="FootnoteReference"/>
         </w:rPr>
-        <w:footnoteReference w:id="63"/>
+        <w:footnoteReference w:id="65"/>
       </w:r>
     </w:p>
     <w:p>
@@ -939,7 +957,7 @@
         <w:rPr>
           <w:rStyle w:val="FootnoteReference"/>
         </w:rPr>
-        <w:footnoteReference w:id="64"/>
+        <w:footnoteReference w:id="66"/>
       </w:r>
       <w:r>
         <w:t xml:space="preserve"> </w:t>
@@ -951,7 +969,7 @@
         <w:rPr>
           <w:rStyle w:val="FootnoteReference"/>
         </w:rPr>
-        <w:footnoteReference w:id="65"/>
+        <w:footnoteReference w:id="67"/>
       </w:r>
     </w:p>
     <w:p>
@@ -965,7 +983,7 @@
         <w:rPr>
           <w:rStyle w:val="FootnoteReference"/>
         </w:rPr>
-        <w:footnoteReference w:id="66"/>
+        <w:footnoteReference w:id="68"/>
       </w:r>
     </w:p>
     <w:p>
@@ -979,7 +997,7 @@
         <w:rPr>
           <w:rStyle w:val="FootnoteReference"/>
         </w:rPr>
-        <w:footnoteReference w:id="67"/>
+        <w:footnoteReference w:id="69"/>
       </w:r>
       <w:r>
         <w:t xml:space="preserve"> </w:t>
@@ -997,18 +1015,18 @@
           <wp:inline>
             <wp:extent cx="5943600" cy="4918055"/>
             <wp:effectExtent b="0" l="0" r="0" t="0"/>
-            <wp:docPr descr="Figure 7.3. The affective circumplex. Emotion words rated by people fall roughly on a circle defined by two axes: valence, from unpleasant to pleasant, and arousal, from calm to activated. Positions are approximate and illustrative." title="" id="69" name="Picture"/>
+            <wp:docPr descr="Figure 7.3. The affective circumplex. Emotion words rated by people fall roughly on a circle defined by two axes: valence, from unpleasant to pleasant, and arousal, from calm to activated. Positions are approximate and illustrative." title="" id="71" name="Picture"/>
             <a:graphic>
               <a:graphicData uri="http://schemas.openxmlformats.org/drawingml/2006/picture">
                 <pic:pic>
                   <pic:nvPicPr>
-                    <pic:cNvPr descr="images/fig_affect_circumplex.png" id="70" name="Picture"/>
+                    <pic:cNvPr descr="images/fig_affect_circumplex.png" id="72" name="Picture"/>
                     <pic:cNvPicPr>
                       <a:picLocks noChangeArrowheads="1" noChangeAspect="1"/>
                     </pic:cNvPicPr>
                   </pic:nvPicPr>
                   <pic:blipFill>
-                    <a:blip r:embed="rId68"/>
+                    <a:blip r:embed="rId70"/>
                     <a:stretch>
                       <a:fillRect/>
                     </a:stretch>
@@ -1043,8 +1061,8 @@
         <w:t xml:space="preserve">Figure 7.3. The affective circumplex. Emotion words rated by people fall roughly on a circle defined by two axes: valence, from unpleasant to pleasant, and arousal, from calm to activated. Positions are approximate and illustrative.</w:t>
       </w:r>
     </w:p>
-    <w:bookmarkEnd w:id="71"/>
-    <w:bookmarkStart w:id="76" w:name="value-depends-on-the-body"/>
+    <w:bookmarkEnd w:id="73"/>
+    <w:bookmarkStart w:id="78" w:name="value-depends-on-the-body"/>
     <w:p>
       <w:pPr>
         <w:pStyle w:val="Heading1"/>
@@ -1064,19 +1082,19 @@
         <w:rPr>
           <w:rStyle w:val="FootnoteReference"/>
         </w:rPr>
-        <w:footnoteReference w:id="72"/>
-      </w:r>
-      <w:r>
-        <w:t xml:space="preserve"> </w:t>
-      </w:r>
-      <w:r>
-        <w:t xml:space="preserve">Cabanac called this alliesthesia: the pleasure of a stimulus is not a property of the stimulus but of its usefulness to the body at that moment. Within a single meal the pleasantness of a food falls as it is eaten, more than that of foods not yet eaten, an effect Barbara Rolls and colleagues called sensory-specific satiety, which is why there is always room for dessert.</w:t>
-      </w:r>
-      <w:r>
-        <w:rPr>
-          <w:rStyle w:val="FootnoteReference"/>
-        </w:rPr>
-        <w:footnoteReference w:id="73"/>
+        <w:footnoteReference w:id="74"/>
+      </w:r>
+      <w:r>
+        <w:t xml:space="preserve"> </w:t>
+      </w:r>
+      <w:r>
+        <w:t xml:space="preserve">Cabanac called this alliesthesia: the pleasure of a stimulus is not a property of the stimulus but of its usefulness to the body at that moment. Within a meal, the food being eaten loses its pleasantness faster than foods not yet eaten, which Barbara Rolls and colleagues called sensory-specific satiety and which is why there is room for dessert.</w:t>
+      </w:r>
+      <w:r>
+        <w:rPr>
+          <w:rStyle w:val="FootnoteReference"/>
+        </w:rPr>
+        <w:footnoteReference w:id="75"/>
       </w:r>
     </w:p>
     <w:p>
@@ -1090,7 +1108,7 @@
         <w:rPr>
           <w:rStyle w:val="FootnoteReference"/>
         </w:rPr>
-        <w:footnoteReference w:id="74"/>
+        <w:footnoteReference w:id="76"/>
       </w:r>
       <w:r>
         <w:t xml:space="preserve"> </w:t>
@@ -1104,13 +1122,13 @@
         <w:pStyle w:val="BodyText"/>
       </w:pPr>
       <w:r>
-        <w:t xml:space="preserve">Reward itself has more than one part. Rats whose dopamine had been almost entirely depleted no longer worked for food, but still made the facial reactions of liking when sugar was placed in their mouths, and on this evidence Kent Berridge and Terry Robinson proposed separating wanting, the motivational pull of a cue, which depends on dopamine, from liking, the hedonic impact of the reward itself, which survives the loss of dopamine and depends on other systems, opioids among them.</w:t>
-      </w:r>
-      <w:r>
-        <w:rPr>
-          <w:rStyle w:val="FootnoteReference"/>
-        </w:rPr>
-        <w:footnoteReference w:id="75"/>
+        <w:t xml:space="preserve">Reward itself has more than one part. Rats whose dopamine had been almost entirely depleted no longer worked for food but still made the facial reactions of liking when sugar was placed in their mouths. On this evidence Kent Berridge and Terry Robinson proposed separating wanting, the dopamine-dependent pull of a cue, from liking, the pleasure of the reward itself, which survives the loss of dopamine.</w:t>
+      </w:r>
+      <w:r>
+        <w:rPr>
+          <w:rStyle w:val="FootnoteReference"/>
+        </w:rPr>
+        <w:footnoteReference w:id="77"/>
       </w:r>
       <w:r>
         <w:t xml:space="preserve"> </w:t>
@@ -1119,8 +1137,8 @@
         <w:t xml:space="preserve">Wanting and liking usually move together, and their divergence, in addiction especially, is one way that what an animal pursues can come apart from what it enjoys.</w:t>
       </w:r>
     </w:p>
-    <w:bookmarkEnd w:id="76"/>
-    <w:bookmarkStart w:id="90" w:name="the-amygdala-and-learned-threat"/>
+    <w:bookmarkEnd w:id="78"/>
+    <w:bookmarkStart w:id="93" w:name="the-amygdala-and-learned-threat"/>
     <w:p>
       <w:pPr>
         <w:pStyle w:val="Heading1"/>
@@ -1142,13 +1160,13 @@
         <w:pStyle w:val="BodyText"/>
       </w:pPr>
       <w:r>
-        <w:t xml:space="preserve">Its importance was first seen in what happened without it. In 1939 Heinrich Klüver and Paul Bucy removed the temporal lobes of rhesus monkeys, normally wary and aggressive animals, and found them transformed: tame, unafraid of snakes or of people, putting everything in their mouths, and repeatedly approaching things that had hurt them.</w:t>
-      </w:r>
-      <w:r>
-        <w:rPr>
-          <w:rStyle w:val="FootnoteReference"/>
-        </w:rPr>
-        <w:footnoteReference w:id="77"/>
+        <w:t xml:space="preserve">Its importance was first seen in its absence. In 1939 Heinrich Klüver and Paul Bucy removed the temporal lobes of normally wary rhesus monkeys and found them transformed: tame, unafraid of snakes or of people, putting everything in their mouths, and repeatedly approaching things that had hurt them.</w:t>
+      </w:r>
+      <w:r>
+        <w:rPr>
+          <w:rStyle w:val="FootnoteReference"/>
+        </w:rPr>
+        <w:footnoteReference w:id="79"/>
       </w:r>
       <w:r>
         <w:t xml:space="preserve"> </w:t>
@@ -1160,7 +1178,7 @@
         <w:rPr>
           <w:rStyle w:val="FootnoteReference"/>
         </w:rPr>
-        <w:footnoteReference w:id="78"/>
+        <w:footnoteReference w:id="80"/>
       </w:r>
     </w:p>
     <w:p>
@@ -1174,7 +1192,7 @@
         <w:rPr>
           <w:rStyle w:val="FootnoteReference"/>
         </w:rPr>
-        <w:footnoteReference w:id="79"/>
+        <w:footnoteReference w:id="81"/>
       </w:r>
     </w:p>
     <w:p>
@@ -1186,18 +1204,18 @@
           <wp:inline>
             <wp:extent cx="5943600" cy="3610094"/>
             <wp:effectExtent b="0" l="0" r="0" t="0"/>
-            <wp:docPr descr="Figure 7.4. The circuit for learned threat. A tone reaches the lateral amygdala directly from the thalamus and indirectly through the auditory cortex, and a shock reaches it through pain pathways; pairing strengthens the tone’s synapses. The central nucleus organizes the response, and after extinction the ventromedial prefrontal cortex suppresses it." title="" id="81" name="Picture"/>
+            <wp:docPr descr="Figure 7.4. The circuit for learned threat. Tone and shock converge on the lateral amygdala, where pairing strengthens the tone’s synapses; the central nucleus organizes the response, and after extinction the ventromedial prefrontal cortex suppresses it." title="" id="83" name="Picture"/>
             <a:graphic>
               <a:graphicData uri="http://schemas.openxmlformats.org/drawingml/2006/picture">
                 <pic:pic>
                   <pic:nvPicPr>
-                    <pic:cNvPr descr="images/fig_threat_circuit.png" id="82" name="Picture"/>
+                    <pic:cNvPr descr="images/fig_threat_circuit.png" id="84" name="Picture"/>
                     <pic:cNvPicPr>
                       <a:picLocks noChangeArrowheads="1" noChangeAspect="1"/>
                     </pic:cNvPicPr>
                   </pic:nvPicPr>
                   <pic:blipFill>
-                    <a:blip r:embed="rId80"/>
+                    <a:blip r:embed="rId82"/>
                     <a:stretch>
                       <a:fillRect/>
                     </a:stretch>
@@ -1229,7 +1247,7 @@
         <w:pStyle w:val="ImageCaption"/>
       </w:pPr>
       <w:r>
-        <w:t xml:space="preserve">Figure 7.4. The circuit for learned threat. A tone reaches the lateral amygdala directly from the thalamus and indirectly through the auditory cortex, and a shock reaches it through pain pathways; pairing strengthens the tone’s synapses. The central nucleus organizes the response, and after extinction the ventromedial prefrontal cortex suppresses it.</w:t>
+        <w:t xml:space="preserve">Figure 7.4. The circuit for learned threat. Tone and shock converge on the lateral amygdala, where pairing strengthens the tone’s synapses; the central nucleus organizes the response, and after extinction the ventromedial prefrontal cortex suppresses it.</w:t>
       </w:r>
     </w:p>
     <w:p>
@@ -1243,19 +1261,19 @@
         <w:rPr>
           <w:rStyle w:val="FootnoteReference"/>
         </w:rPr>
-        <w:footnoteReference w:id="83"/>
-      </w:r>
-      <w:r>
-        <w:t xml:space="preserve"> </w:t>
-      </w:r>
-      <w:r>
-        <w:t xml:space="preserve">Luiz Pessoa and Ralph Adolphs argue that in primates the subcortical route has not been shown to be faster in practice or capable of the fine discriminations attributed to it, and that the amygdala is better seen as one hub among many roads by which the brain evaluates what is significant.</w:t>
-      </w:r>
-      <w:r>
-        <w:rPr>
-          <w:rStyle w:val="FootnoteReference"/>
-        </w:rPr>
-        <w:footnoteReference w:id="84"/>
+        <w:footnoteReference w:id="85"/>
+      </w:r>
+      <w:r>
+        <w:t xml:space="preserve"> </w:t>
+      </w:r>
+      <w:r>
+        <w:t xml:space="preserve">Luiz Pessoa and Ralph Adolphs argue that in primates the subcortical route has not been shown to be faster in practice or capable of fine discrimination, and that the amygdala is one hub among many roads by which the brain evaluates significance.</w:t>
+      </w:r>
+      <w:r>
+        <w:rPr>
+          <w:rStyle w:val="FootnoteReference"/>
+        </w:rPr>
+        <w:footnoteReference w:id="86"/>
       </w:r>
       <w:r>
         <w:t xml:space="preserve"> </w:t>
@@ -1267,7 +1285,7 @@
         <w:rPr>
           <w:rStyle w:val="FootnoteReference"/>
         </w:rPr>
-        <w:footnoteReference w:id="85"/>
+        <w:footnoteReference w:id="87"/>
       </w:r>
       <w:r>
         <w:t xml:space="preserve"> </w:t>
@@ -1281,13 +1299,13 @@
         <w:pStyle w:val="BodyText"/>
       </w:pPr>
       <w:r>
-        <w:t xml:space="preserve">The amygdala is not a fear center. In monkeys, Daniel Salzman’s laboratory recorded amygdala neurons while visual cues predicted juice or an air puff to the face, and found cells that signaled positive value and cells that signaled negative value, each changing its response when the meaning of the cue was reversed.</w:t>
-      </w:r>
-      <w:r>
-        <w:rPr>
-          <w:rStyle w:val="FootnoteReference"/>
-        </w:rPr>
-        <w:footnoteReference w:id="86"/>
+        <w:t xml:space="preserve">The amygdala is not a fear center. In monkeys whose visual cues predicted juice or an air puff, Daniel Salzman’s laboratory found amygdala cells signaling positive value and cells signaling negative value, each changing its response when the meaning of the cue was reversed.</w:t>
+      </w:r>
+      <w:r>
+        <w:rPr>
+          <w:rStyle w:val="FootnoteReference"/>
+        </w:rPr>
+        <w:footnoteReference w:id="88"/>
       </w:r>
       <w:r>
         <w:t xml:space="preserve"> </w:t>
@@ -1299,7 +1317,19 @@
         <w:rPr>
           <w:rStyle w:val="FootnoteReference"/>
         </w:rPr>
-        <w:footnoteReference w:id="87"/>
+        <w:footnoteReference w:id="89"/>
+      </w:r>
+      <w:r>
+        <w:t xml:space="preserve"> </w:t>
+      </w:r>
+      <w:r>
+        <w:t xml:space="preserve">Nor does it work alone. A brief, cued fear depends on the central nucleus, but a sustained state of anxiety about threats that are uncertain or distant depends more on a neighboring structure, the bed nucleus of the stria terminalis.</w:t>
+      </w:r>
+      <w:r>
+        <w:rPr>
+          <w:rStyle w:val="FootnoteReference"/>
+        </w:rPr>
+        <w:footnoteReference w:id="90"/>
       </w:r>
     </w:p>
     <w:p>
@@ -1313,7 +1343,7 @@
         <w:rPr>
           <w:rStyle w:val="FootnoteReference"/>
         </w:rPr>
-        <w:footnoteReference w:id="88"/>
+        <w:footnoteReference w:id="91"/>
       </w:r>
     </w:p>
     <w:p>
@@ -1327,17 +1357,17 @@
         <w:rPr>
           <w:rStyle w:val="FootnoteReference"/>
         </w:rPr>
-        <w:footnoteReference w:id="89"/>
-      </w:r>
-      <w:r>
-        <w:t xml:space="preserve"> </w:t>
-      </w:r>
-      <w:r>
-        <w:t xml:space="preserve">The amygdala is needed for fear of external threats, the kind learned from experience. A threat from inside the body, detected by chemical sensors elsewhere, presumably in the brainstem, produces fear without it.</w:t>
-      </w:r>
-    </w:p>
-    <w:bookmarkEnd w:id="90"/>
-    <w:bookmarkStart w:id="96" w:name="unlearning-fear"/>
+        <w:footnoteReference w:id="92"/>
+      </w:r>
+      <w:r>
+        <w:t xml:space="preserve"> </w:t>
+      </w:r>
+      <w:r>
+        <w:t xml:space="preserve">The amygdala is needed for fear of threats from outside the body. A threat from inside the body, detected by chemical sensors outside the amygdala, probably in the brainstem, produces fear without it.</w:t>
+      </w:r>
+    </w:p>
+    <w:bookmarkEnd w:id="93"/>
+    <w:bookmarkStart w:id="99" w:name="unlearning-fear"/>
     <w:p>
       <w:pPr>
         <w:pStyle w:val="Heading1"/>
@@ -1351,13 +1381,13 @@
         <w:pStyle w:val="FirstParagraph"/>
       </w:pPr>
       <w:r>
-        <w:t xml:space="preserve">A threat prediction that could only be learned would be a trap, since the world changes. If the tone is played many times without shock, the rat stops freezing, a process called extinction. Extinction is not forgetting. Mark Bouton showed that an extinguished fear returns if the animal is tested in a different context from the one in which extinction took place, if time passes, or if an unsignaled shock is given, so the original association must still be there.</w:t>
-      </w:r>
-      <w:r>
-        <w:rPr>
-          <w:rStyle w:val="FootnoteReference"/>
-        </w:rPr>
-        <w:footnoteReference w:id="91"/>
+        <w:t xml:space="preserve">A threat prediction that could only be learned would be a trap, since the world changes. If the tone is played many times without shock, the rat stops freezing, a process called extinction. Extinction is not forgetting. Mark Bouton showed that an extinguished fear returns in a different context, with the passage of time, or after an unsignaled shock, so the original association must still be there.</w:t>
+      </w:r>
+      <w:r>
+        <w:rPr>
+          <w:rStyle w:val="FootnoteReference"/>
+        </w:rPr>
+        <w:footnoteReference w:id="94"/>
       </w:r>
       <w:r>
         <w:t xml:space="preserve"> </w:t>
@@ -1377,25 +1407,25 @@
         <w:rPr>
           <w:rStyle w:val="FootnoteReference"/>
         </w:rPr>
-        <w:footnoteReference w:id="92"/>
-      </w:r>
-      <w:r>
-        <w:t xml:space="preserve"> </w:t>
-      </w:r>
-      <w:r>
-        <w:t xml:space="preserve">In people the corresponding area is the ventromedial prefrontal cortex.</w:t>
-      </w:r>
-      <w:r>
-        <w:rPr>
-          <w:rStyle w:val="FootnoteReference"/>
-        </w:rPr>
-        <w:footnoteReference w:id="93"/>
-      </w:r>
-      <w:r>
-        <w:t xml:space="preserve"> </w:t>
-      </w:r>
-      <w:r>
-        <w:t xml:space="preserve">In adults, the prefrontal cortex mostly inhibits the expression of the amygdala’s memory rather than erasing it, which is why the fear can return and why, as Chapter 5 noted, fear is easily learned and rarely unlearned, only suppressed.</w:t>
+        <w:footnoteReference w:id="95"/>
+      </w:r>
+      <w:r>
+        <w:t xml:space="preserve"> </w:t>
+      </w:r>
+      <w:r>
+        <w:t xml:space="preserve">In people the corresponding area, the ventromedial prefrontal cortex, is engaged when an extinguished fear is recalled the next day.</w:t>
+      </w:r>
+      <w:r>
+        <w:rPr>
+          <w:rStyle w:val="FootnoteReference"/>
+        </w:rPr>
+        <w:footnoteReference w:id="96"/>
+      </w:r>
+      <w:r>
+        <w:t xml:space="preserve"> </w:t>
+      </w:r>
+      <w:r>
+        <w:t xml:space="preserve">The prefrontal cortex mostly inhibits the expression of the amygdala’s memory rather than erasing it, which is why the fear can return and why, as Chapter 5 noted, fear is easily learned and rarely unlearned, only suppressed.</w:t>
       </w:r>
     </w:p>
     <w:p>
@@ -1409,29 +1439,29 @@
         <w:rPr>
           <w:rStyle w:val="FootnoteReference"/>
         </w:rPr>
-        <w:footnoteReference w:id="94"/>
-      </w:r>
-      <w:r>
-        <w:t xml:space="preserve"> </w:t>
-      </w:r>
-      <w:r>
-        <w:t xml:space="preserve">Reappraisal acts early, by changing what the situation means, rather than late, by suppressing the response once it is under way.</w:t>
-      </w:r>
-      <w:r>
-        <w:rPr>
-          <w:rStyle w:val="FootnoteReference"/>
-        </w:rPr>
-        <w:footnoteReference w:id="95"/>
-      </w:r>
-      <w:r>
-        <w:t xml:space="preserve"> </w:t>
-      </w:r>
-      <w:r>
-        <w:t xml:space="preserve">It is extinction made voluntary: a new prediction about what the situation means, issued from the cortex to the circuits that prepare the body.</w:t>
-      </w:r>
-    </w:p>
-    <w:bookmarkEnd w:id="96"/>
-    <w:bookmarkStart w:id="113" w:name="the-chemistry-of-stress"/>
+        <w:footnoteReference w:id="97"/>
+      </w:r>
+      <w:r>
+        <w:t xml:space="preserve"> </w:t>
+      </w:r>
+      <w:r>
+        <w:t xml:space="preserve">Reappraisal acts early, by changing what the situation means, rather than by suppressing the response once it is under way;</w:t>
+      </w:r>
+      <w:r>
+        <w:rPr>
+          <w:rStyle w:val="FootnoteReference"/>
+        </w:rPr>
+        <w:footnoteReference w:id="98"/>
+      </w:r>
+      <w:r>
+        <w:t xml:space="preserve"> </w:t>
+      </w:r>
+      <w:r>
+        <w:t xml:space="preserve">it is extinction made voluntary.</w:t>
+      </w:r>
+    </w:p>
+    <w:bookmarkEnd w:id="99"/>
+    <w:bookmarkStart w:id="119" w:name="the-chemistry-of-stress"/>
     <w:p>
       <w:pPr>
         <w:pStyle w:val="Heading1"/>
@@ -1451,7 +1481,7 @@
         <w:rPr>
           <w:rStyle w:val="FootnoteReference"/>
         </w:rPr>
-        <w:footnoteReference w:id="97"/>
+        <w:footnoteReference w:id="100"/>
       </w:r>
     </w:p>
     <w:p>
@@ -1463,18 +1493,18 @@
           <wp:inline>
             <wp:extent cx="5943600" cy="3481606"/>
             <wp:effectExtent b="0" l="0" r="0" t="0"/>
-            <wp:docPr descr="Figure 7.5. The two arms of the stress response. Fast: the sympathetic nervous system and adrenaline from the adrenal medulla, within seconds. Slow: the hypothalamic-pituitary-adrenal axis, from corticotropin-releasing hormone (CRH) to adrenocorticotropic hormone (ACTH) to cortisol, over tens of minutes. Cortisol feeds back to stop its own release." title="" id="99" name="Picture"/>
+            <wp:docPr descr="Figure 7.5. The two arms of the stress response. Fast: the sympathetic nervous system and adrenaline from the adrenal medulla, within seconds. Slow: the hypothalamic-pituitary-adrenal axis, from corticotropin-releasing hormone (CRH) to adrenocorticotropic hormone (ACTH) to cortisol, over tens of minutes. Cortisol feeds back to stop its own release." title="" id="102" name="Picture"/>
             <a:graphic>
               <a:graphicData uri="http://schemas.openxmlformats.org/drawingml/2006/picture">
                 <pic:pic>
                   <pic:nvPicPr>
-                    <pic:cNvPr descr="images/fig_stress_axes.png" id="100" name="Picture"/>
+                    <pic:cNvPr descr="images/fig_stress_axes.png" id="103" name="Picture"/>
                     <pic:cNvPicPr>
                       <a:picLocks noChangeArrowheads="1" noChangeAspect="1"/>
                     </pic:cNvPicPr>
                   </pic:nvPicPr>
                   <pic:blipFill>
-                    <a:blip r:embed="rId98"/>
+                    <a:blip r:embed="rId101"/>
                     <a:stretch>
                       <a:fillRect/>
                     </a:stretch>
@@ -1514,25 +1544,25 @@
         <w:pStyle w:val="BodyText"/>
       </w:pPr>
       <w:r>
-        <w:t xml:space="preserve">Hans Selye discovered the generality of this response in 1936, when he found that rats exposed to cold, injury, toxins, or forced exercise all developed the same enlargement of the adrenal glands, shrinkage of the thymus, and stomach ulcers, whatever the insult.</w:t>
-      </w:r>
-      <w:r>
-        <w:rPr>
-          <w:rStyle w:val="FootnoteReference"/>
-        </w:rPr>
-        <w:footnoteReference w:id="101"/>
-      </w:r>
-      <w:r>
-        <w:t xml:space="preserve"> </w:t>
-      </w:r>
-      <w:r>
-        <w:t xml:space="preserve">Robert Sapolsky and colleagues showed that cortisol’s actions, which depend on timing, include restraining the stress response itself before it does damage.</w:t>
-      </w:r>
-      <w:r>
-        <w:rPr>
-          <w:rStyle w:val="FootnoteReference"/>
-        </w:rPr>
-        <w:footnoteReference w:id="102"/>
+        <w:t xml:space="preserve">Hans Selye discovered the generality of this response in 1936: rats exposed to cold, injury, toxins, or forced exercise all developed the same enlarged adrenal glands, shrunken thymus, and stomach ulcers.</w:t>
+      </w:r>
+      <w:r>
+        <w:rPr>
+          <w:rStyle w:val="FootnoteReference"/>
+        </w:rPr>
+        <w:footnoteReference w:id="104"/>
+      </w:r>
+      <w:r>
+        <w:t xml:space="preserve"> </w:t>
+      </w:r>
+      <w:r>
+        <w:t xml:space="preserve">Robert Sapolsky and colleagues showed that some of cortisol’s actions prepare the body for demand while others, arriving later, restrain the stress response itself before it does damage.</w:t>
+      </w:r>
+      <w:r>
+        <w:rPr>
+          <w:rStyle w:val="FootnoteReference"/>
+        </w:rPr>
+        <w:footnoteReference w:id="105"/>
       </w:r>
       <w:r>
         <w:t xml:space="preserve"> </w:t>
@@ -1544,7 +1574,7 @@
         <w:rPr>
           <w:rStyle w:val="FootnoteReference"/>
         </w:rPr>
-        <w:footnoteReference w:id="103"/>
+        <w:footnoteReference w:id="106"/>
       </w:r>
       <w:r>
         <w:t xml:space="preserve"> </w:t>
@@ -1558,19 +1588,45 @@
         <w:pStyle w:val="BodyText"/>
       </w:pPr>
       <w:r>
+        <w:t xml:space="preserve">The settings of this system are shaped by experience, starting early. Rat pups whose mothers licked and groomed them more in the first days of life grow up with more of the receptors through which cortisol acts in the hippocampus, stronger feedback, and smaller stress responses.</w:t>
+      </w:r>
+      <w:r>
+        <w:rPr>
+          <w:rStyle w:val="FootnoteReference"/>
+        </w:rPr>
+        <w:footnoteReference w:id="107"/>
+      </w:r>
+      <w:r>
+        <w:t xml:space="preserve"> </w:t>
+      </w:r>
+      <w:r>
+        <w:t xml:space="preserve">Its response in the moment also depends on company: women in an MRI scanner who were threatened with a mild shock showed less activity in threat-related regions while holding their husband’s hand.</w:t>
+      </w:r>
+      <w:r>
+        <w:rPr>
+          <w:rStyle w:val="FootnoteReference"/>
+        </w:rPr>
+        <w:footnoteReference w:id="108"/>
+      </w:r>
+    </w:p>
+    <w:p>
+      <w:pPr>
+        <w:pStyle w:val="BodyText"/>
+      </w:pPr>
+      <w:r>
         <w:t xml:space="preserve">The chemistry of stress acts on the brain as well as the body, and its effects follow an inverted U. In 1908 Robert Yerkes and John Dodson trained mice to choose between a light and a dark box, with an electric shock for mistakes, and found that for a hard discrimination a moderate shock produced faster learning than a weak one or a strong one.</w:t>
       </w:r>
       <w:r>
         <w:rPr>
           <w:rStyle w:val="FootnoteReference"/>
         </w:rPr>
-        <w:footnoteReference w:id="104"/>
-      </w:r>
-      <w:r>
-        <w:t xml:space="preserve"> </w:t>
-      </w:r>
-      <w:r>
-        <w:t xml:space="preserve">They varied shock and task difficulty, not arousal, and the reading of their curve as a law of arousal came decades later.</w:t>
+        <w:footnoteReference w:id="109"/>
+      </w:r>
+      <w:r>
+        <w:t xml:space="preserve"> </w:t>
+      </w:r>
+      <w:r>
+        <w:t xml:space="preserve">They varied shock and task difficulty, not arousal, and it was later writers who turned their curve into a law of arousal.</w:t>
       </w:r>
     </w:p>
     <w:p>
@@ -1584,13 +1640,25 @@
         <w:rPr>
           <w:rStyle w:val="FootnoteReference"/>
         </w:rPr>
-        <w:footnoteReference w:id="105"/>
-      </w:r>
-      <w:r>
-        <w:t xml:space="preserve"> </w:t>
-      </w:r>
-      <w:r>
-        <w:t xml:space="preserve">Figure 7.6 shows the shape. Under acute stress control shifts from deliberation to fast, practiced, defensive responses, the right trade in an emergency and the wrong one in an examination.</w:t>
+        <w:footnoteReference w:id="110"/>
+      </w:r>
+      <w:r>
+        <w:t xml:space="preserve"> </w:t>
+      </w:r>
+      <w:r>
+        <w:t xml:space="preserve">Cortisol has an inverted U of its own: it acts through one receptor occupied even at rest and another engaged only under stress, and memory is best when the first is filled and the second moderately engaged.</w:t>
+      </w:r>
+      <w:r>
+        <w:rPr>
+          <w:rStyle w:val="FootnoteReference"/>
+        </w:rPr>
+        <w:footnoteReference w:id="111"/>
+      </w:r>
+      <w:r>
+        <w:t xml:space="preserve"> </w:t>
+      </w:r>
+      <w:r>
+        <w:t xml:space="preserve">Figure 7.6 shows the shape for norepinephrine and dopamine. Under acute stress control shifts from deliberation to fast, practiced, defensive responses, the right trade in an emergency and the wrong one in an examination.</w:t>
       </w:r>
     </w:p>
     <w:p>
@@ -1602,18 +1670,18 @@
           <wp:inline>
             <wp:extent cx="5943600" cy="3391158"/>
             <wp:effectExtent b="0" l="0" r="0" t="0"/>
-            <wp:docPr descr="Figure 7.6. An inverted U (illustrative). Prefrontal function rises with modest levels of norepinephrine and dopamine and falls at the high levels released under stress, while amygdala-driven and habitual responses gain control." title="" id="107" name="Picture"/>
+            <wp:docPr descr="Figure 7.6. An inverted U (illustrative). Prefrontal function rises with modest levels of norepinephrine and dopamine and falls at the high levels released under stress, while amygdala-driven and habitual responses gain control." title="" id="113" name="Picture"/>
             <a:graphic>
               <a:graphicData uri="http://schemas.openxmlformats.org/drawingml/2006/picture">
                 <pic:pic>
                   <pic:nvPicPr>
-                    <pic:cNvPr descr="images/fig_inverted_u.png" id="108" name="Picture"/>
+                    <pic:cNvPr descr="images/fig_inverted_u.png" id="114" name="Picture"/>
                     <pic:cNvPicPr>
                       <a:picLocks noChangeArrowheads="1" noChangeAspect="1"/>
                     </pic:cNvPicPr>
                   </pic:nvPicPr>
                   <pic:blipFill>
-                    <a:blip r:embed="rId106"/>
+                    <a:blip r:embed="rId112"/>
                     <a:stretch>
                       <a:fillRect/>
                     </a:stretch>
@@ -1659,7 +1727,7 @@
         <w:rPr>
           <w:rStyle w:val="FootnoteReference"/>
         </w:rPr>
-        <w:footnoteReference w:id="109"/>
+        <w:footnoteReference w:id="115"/>
       </w:r>
       <w:r>
         <w:t xml:space="preserve"> </w:t>
@@ -1671,7 +1739,7 @@
         <w:rPr>
           <w:rStyle w:val="FootnoteReference"/>
         </w:rPr>
-        <w:footnoteReference w:id="110"/>
+        <w:footnoteReference w:id="116"/>
       </w:r>
       <w:r>
         <w:t xml:space="preserve"> </w:t>
@@ -1683,23 +1751,23 @@
         <w:rPr>
           <w:rStyle w:val="FootnoteReference"/>
         </w:rPr>
-        <w:footnoteReference w:id="111"/>
-      </w:r>
-      <w:r>
-        <w:t xml:space="preserve"> </w:t>
-      </w:r>
-      <w:r>
-        <w:t xml:space="preserve">Prolonged stress thus removes structure from a region for flexible, contextual memory and adds it to a region for learned threat, and the two changes differ in how long they last. In rodents much of the hippocampal shrinkage reverses when the stress ends, but the growth in the amygdala, and the anxious behavior that goes with it, persisted three weeks into recovery.</w:t>
-      </w:r>
-      <w:r>
-        <w:rPr>
-          <w:rStyle w:val="FootnoteReference"/>
-        </w:rPr>
-        <w:footnoteReference w:id="112"/>
-      </w:r>
-    </w:p>
-    <w:bookmarkEnd w:id="113"/>
-    <w:bookmarkStart w:id="121" w:name="when-regulation-goes-wrong"/>
+        <w:footnoteReference w:id="117"/>
+      </w:r>
+      <w:r>
+        <w:t xml:space="preserve"> </w:t>
+      </w:r>
+      <w:r>
+        <w:t xml:space="preserve">Prolonged stress thus removes structure from a region for flexible, contextual memory and adds it to a region for learned threat, and the two changes differ in how long they last. In rodents much of the hippocampal shrinkage reverses when the stress ends, but the growth in the amygdala, and the anxious behavior that goes with it, persists at least three weeks into recovery.</w:t>
+      </w:r>
+      <w:r>
+        <w:rPr>
+          <w:rStyle w:val="FootnoteReference"/>
+        </w:rPr>
+        <w:footnoteReference w:id="118"/>
+      </w:r>
+    </w:p>
+    <w:bookmarkEnd w:id="119"/>
+    <w:bookmarkStart w:id="127" w:name="when-regulation-goes-wrong"/>
     <w:p>
       <w:pPr>
         <w:pStyle w:val="Heading1"/>
@@ -1719,7 +1787,7 @@
         <w:rPr>
           <w:rStyle w:val="FootnoteReference"/>
         </w:rPr>
-        <w:footnoteReference w:id="114"/>
+        <w:footnoteReference w:id="120"/>
       </w:r>
       <w:r>
         <w:t xml:space="preserve"> </w:t>
@@ -1731,19 +1799,19 @@
         <w:rPr>
           <w:rStyle w:val="FootnoteReference"/>
         </w:rPr>
-        <w:footnoteReference w:id="115"/>
-      </w:r>
-      <w:r>
-        <w:t xml:space="preserve"> </w:t>
-      </w:r>
-      <w:r>
-        <w:t xml:space="preserve">S.M.’s carbon dioxide panic fits this account. Martin Paulus and Murray Stein have proposed more generally that anxiety reflects an inflated interoceptive prediction error in the insula, a body that is persistently predicted to be in more trouble than it is.</w:t>
-      </w:r>
-      <w:r>
-        <w:rPr>
-          <w:rStyle w:val="FootnoteReference"/>
-        </w:rPr>
-        <w:footnoteReference w:id="116"/>
+        <w:footnoteReference w:id="121"/>
+      </w:r>
+      <w:r>
+        <w:t xml:space="preserve"> </w:t>
+      </w:r>
+      <w:r>
+        <w:t xml:space="preserve">S.M.’s carbon dioxide panic fits this account. Martin Paulus and Murray Stein proposed more generally that anxiety is an inflated interoceptive prediction error in the insula, a body persistently predicted to be in more trouble than it is.</w:t>
+      </w:r>
+      <w:r>
+        <w:rPr>
+          <w:rStyle w:val="FootnoteReference"/>
+        </w:rPr>
+        <w:footnoteReference w:id="122"/>
       </w:r>
     </w:p>
     <w:p>
@@ -1757,49 +1825,49 @@
         <w:rPr>
           <w:rStyle w:val="FootnoteReference"/>
         </w:rPr>
-        <w:footnoteReference w:id="117"/>
-      </w:r>
-      <w:r>
-        <w:t xml:space="preserve"> </w:t>
-      </w:r>
-      <w:r>
-        <w:t xml:space="preserve">The overlap between depression and the sickness behavior that inflammation induces is one reason the proposal is taken seriously.</w:t>
-      </w:r>
-      <w:r>
-        <w:rPr>
-          <w:rStyle w:val="FootnoteReference"/>
-        </w:rPr>
-        <w:footnoteReference w:id="118"/>
-      </w:r>
-      <w:r>
-        <w:t xml:space="preserve"> </w:t>
-      </w:r>
-      <w:r>
-        <w:t xml:space="preserve">Alexithymia, a difficulty in identifying one’s own feelings, goes with poorer interoception.</w:t>
-      </w:r>
-      <w:r>
-        <w:rPr>
-          <w:rStyle w:val="FootnoteReference"/>
-        </w:rPr>
-        <w:footnoteReference w:id="119"/>
-      </w:r>
-    </w:p>
-    <w:p>
-      <w:pPr>
-        <w:pStyle w:val="BodyText"/>
-      </w:pPr>
-      <w:r>
-        <w:t xml:space="preserve">The evidence for these hypotheses is largely correlational. What they offer is a common language: if feeling is an estimate, disorders of feeling are errors of estimation, and treatments with good evidence behind them, such as exposure therapy and the reappraisal practiced in cognitive behavioral therapy, can be read as ways of correcting it. Not every treatment the account suggests has worked: propranolol, which blocks the body’s response to adrenaline, is often prescribed for stage fright, but a systematic review found the evidence insufficient to support its routine use for any anxiety disorder.</w:t>
-      </w:r>
-      <w:r>
-        <w:rPr>
-          <w:rStyle w:val="FootnoteReference"/>
-        </w:rPr>
-        <w:footnoteReference w:id="120"/>
-      </w:r>
-    </w:p>
-    <w:bookmarkEnd w:id="121"/>
-    <w:bookmarkStart w:id="130" w:name="emotion-marks-what-to-remember"/>
+        <w:footnoteReference w:id="123"/>
+      </w:r>
+      <w:r>
+        <w:t xml:space="preserve"> </w:t>
+      </w:r>
+      <w:r>
+        <w:t xml:space="preserve">Depression’s overlap with the sickness behavior that inflammation induces is one reason the proposal is taken seriously.</w:t>
+      </w:r>
+      <w:r>
+        <w:rPr>
+          <w:rStyle w:val="FootnoteReference"/>
+        </w:rPr>
+        <w:footnoteReference w:id="124"/>
+      </w:r>
+      <w:r>
+        <w:t xml:space="preserve"> </w:t>
+      </w:r>
+      <w:r>
+        <w:t xml:space="preserve">And alexithymia, a difficulty in identifying one’s own feelings, has been linked with poorer interoception across many kinds of bodily signal.</w:t>
+      </w:r>
+      <w:r>
+        <w:rPr>
+          <w:rStyle w:val="FootnoteReference"/>
+        </w:rPr>
+        <w:footnoteReference w:id="125"/>
+      </w:r>
+    </w:p>
+    <w:p>
+      <w:pPr>
+        <w:pStyle w:val="BodyText"/>
+      </w:pPr>
+      <w:r>
+        <w:t xml:space="preserve">The evidence for these hypotheses is largely correlational. What they offer is a common language: if feeling is an estimate, disorders of feeling are errors of estimation, and treatments with good evidence behind them, such as exposure therapy and the reappraisal practiced in cognitive behavioral therapy, can be read as ways of correcting them. Not every treatment the account suggests has worked: propranolol, which blocks the body’s response to adrenaline, is often prescribed for stage fright, but a systematic review found the evidence insufficient to support its routine use for any anxiety disorder.</w:t>
+      </w:r>
+      <w:r>
+        <w:rPr>
+          <w:rStyle w:val="FootnoteReference"/>
+        </w:rPr>
+        <w:footnoteReference w:id="126"/>
+      </w:r>
+    </w:p>
+    <w:bookmarkEnd w:id="127"/>
+    <w:bookmarkStart w:id="136" w:name="emotion-marks-what-to-remember"/>
     <w:p>
       <w:pPr>
         <w:pStyle w:val="Heading1"/>
@@ -1819,7 +1887,7 @@
         <w:rPr>
           <w:rStyle w:val="FootnoteReference"/>
         </w:rPr>
-        <w:footnoteReference w:id="122"/>
+        <w:footnoteReference w:id="128"/>
       </w:r>
     </w:p>
     <w:p>
@@ -1833,19 +1901,19 @@
         <w:rPr>
           <w:rStyle w:val="FootnoteReference"/>
         </w:rPr>
-        <w:footnoteReference w:id="123"/>
-      </w:r>
-      <w:r>
-        <w:t xml:space="preserve"> </w:t>
-      </w:r>
-      <w:r>
-        <w:t xml:space="preserve">Given after the training, it could not have changed what the rats experienced, only what they kept. Adrenaline does not cross into the brain. McGaugh’s laboratory showed that its effect is relayed by the vagus nerve to the nucleus of the solitary tract, the interoceptive pathway of Figure 7.2, which releases norepinephrine in the basolateral amygdala; the amygdala then modulates consolidation in the hippocampus, the striatum, and the cortex, where the memories are actually stored.</w:t>
-      </w:r>
-      <w:r>
-        <w:rPr>
-          <w:rStyle w:val="FootnoteReference"/>
-        </w:rPr>
-        <w:footnoteReference w:id="124"/>
+        <w:footnoteReference w:id="129"/>
+      </w:r>
+      <w:r>
+        <w:t xml:space="preserve"> </w:t>
+      </w:r>
+      <w:r>
+        <w:t xml:space="preserve">Given after the training, the injection could not have changed what the rats experienced, only what they kept. Adrenaline does not readily enter the brain; McGaugh’s laboratory showed that its effect is relayed, at least in part, by the vagus nerve, the interoceptive pathway of Figure 7.2, to release norepinephrine in the basolateral amygdala, which then modulates consolidation in the hippocampus, striatum, and cortex where the memories are stored.</w:t>
+      </w:r>
+      <w:r>
+        <w:rPr>
+          <w:rStyle w:val="FootnoteReference"/>
+        </w:rPr>
+        <w:footnoteReference w:id="130"/>
       </w:r>
     </w:p>
     <w:p>
@@ -1859,7 +1927,7 @@
         <w:rPr>
           <w:rStyle w:val="FootnoteReference"/>
         </w:rPr>
-        <w:footnoteReference w:id="125"/>
+        <w:footnoteReference w:id="131"/>
       </w:r>
       <w:r>
         <w:t xml:space="preserve"> </w:t>
@@ -1879,7 +1947,7 @@
         <w:rPr>
           <w:rStyle w:val="FootnoteReference"/>
         </w:rPr>
-        <w:footnoteReference w:id="126"/>
+        <w:footnoteReference w:id="132"/>
       </w:r>
       <w:r>
         <w:t xml:space="preserve"> </w:t>
@@ -1899,43 +1967,41 @@
         <w:rPr>
           <w:rStyle w:val="FootnoteReference"/>
         </w:rPr>
-        <w:footnoteReference w:id="127"/>
-      </w:r>
-      <w:r>
-        <w:t xml:space="preserve"> </w:t>
-      </w:r>
-      <w:r>
-        <w:t xml:space="preserve">Students asked by Ulric Neisser and Nicole Harsch the morning after the Challenger shuttle exploded in 1986 gave, two and a half years later, accounts that often differed from their originals and were held with high confidence.</w:t>
-      </w:r>
-      <w:r>
-        <w:rPr>
-          <w:rStyle w:val="FootnoteReference"/>
-        </w:rPr>
-        <w:footnoteReference w:id="128"/>
-      </w:r>
-      <w:r>
-        <w:t xml:space="preserve"> </w:t>
-      </w:r>
-      <w:r>
-        <w:t xml:space="preserve">Jennifer Talarico and David Rubin repeated the design the day after the attacks of September 11, 2001, with an ordinary event from the same week as a control, and found that memories of the attacks lost consistency over the following months as fast as the ordinary memories did. What distinguished them was that people went on believing them.</w:t>
-      </w:r>
-      <w:r>
-        <w:rPr>
-          <w:rStyle w:val="FootnoteReference"/>
-        </w:rPr>
-        <w:footnoteReference w:id="129"/>
-      </w:r>
-    </w:p>
-    <w:p>
-      <w:pPr>
-        <w:pStyle w:val="BodyText"/>
-      </w:pPr>
+        <w:footnoteReference w:id="133"/>
+      </w:r>
+      <w:r>
+        <w:t xml:space="preserve"> </w:t>
+      </w:r>
+      <w:r>
+        <w:t xml:space="preserve">The morning after the Challenger shuttle exploded in 1986, Ulric Neisser and Nicole Harsch asked students how they had heard the news. Two and a half years later, many gave different accounts and held them with high confidence.</w:t>
+      </w:r>
+      <w:r>
+        <w:rPr>
+          <w:rStyle w:val="FootnoteReference"/>
+        </w:rPr>
+        <w:footnoteReference w:id="134"/>
+      </w:r>
+      <w:r>
+        <w:t xml:space="preserve"> </w:t>
+      </w:r>
+      <w:r>
+        <w:t xml:space="preserve">Jennifer Talarico and David Rubin repeated the design the day after the attacks of September 11, 2001, with an ordinary event from the same week as a control; over the following months the memories of the attacks lost consistency as fast as the ordinary ones. What distinguished them was that people went on believing them.</w:t>
+      </w:r>
+      <w:r>
+        <w:rPr>
+          <w:rStyle w:val="FootnoteReference"/>
+        </w:rPr>
+        <w:footnoteReference w:id="135"/>
+      </w:r>
+      <w:r>
+        <w:t xml:space="preserve"> </w:t>
+      </w:r>
       <w:r>
         <w:t xml:space="preserve">Emotion tells the brain to keep a memory and to trust it, which is not the same as keeping it accurately, and the reconsolidation of Chapter 5 gives each retelling a chance to change it.</w:t>
       </w:r>
     </w:p>
-    <w:bookmarkEnd w:id="130"/>
-    <w:bookmarkStart w:id="145" w:name="feeling-and-choosing"/>
+    <w:bookmarkEnd w:id="136"/>
+    <w:bookmarkStart w:id="151" w:name="feeling-and-choosing"/>
     <w:p>
       <w:pPr>
         <w:pStyle w:val="Heading1"/>
@@ -1957,7 +2023,7 @@
         <w:pStyle w:val="BodyText"/>
       </w:pPr>
       <w:r>
-        <w:t xml:space="preserve">The classic case is Phineas Gage, the railroad foreman whose left frontal lobe was pierced in 1848 by an iron rod driven up through his cheek and out through the top of his skull by an accidental blast. He survived. Twenty years later his physician, John Harlow, reported that he had become</w:t>
+        <w:t xml:space="preserve">The classic case is Phineas Gage, the railroad foreman whose left frontal lobe was pierced in 1848 by an iron rod driven through his cheek and out of the top of his skull by an accidental blast. He survived. Twenty years later his physician, John Harlow, reported that he had become</w:t>
       </w:r>
       <w:r>
         <w:t xml:space="preserve"> </w:t>
@@ -1984,13 +2050,16 @@
         <w:t xml:space="preserve">“</w:t>
       </w:r>
       <w:r>
-        <w:t xml:space="preserve">the animal passions of a strong man</w:t>
+        <w:t xml:space="preserve">the animal passions of a strong man,</w:t>
       </w:r>
       <w:r>
         <w:t xml:space="preserve">”</w:t>
       </w:r>
       <w:r>
-        <w:t xml:space="preserve">, and that his friends said he was</w:t>
+        <w:t xml:space="preserve"> </w:t>
+      </w:r>
+      <w:r>
+        <w:t xml:space="preserve">and that his friends said he was</w:t>
       </w:r>
       <w:r>
         <w:t xml:space="preserve"> </w:t>
@@ -1999,31 +2068,28 @@
         <w:t xml:space="preserve">“</w:t>
       </w:r>
       <w:r>
-        <w:t xml:space="preserve">no longer Gage</w:t>
+        <w:t xml:space="preserve">no longer Gage.</w:t>
       </w:r>
       <w:r>
         <w:t xml:space="preserve">”</w:t>
       </w:r>
       <w:r>
-        <w:t xml:space="preserve">.</w:t>
-      </w:r>
-      <w:r>
-        <w:rPr>
-          <w:rStyle w:val="FootnoteReference"/>
-        </w:rPr>
-        <w:footnoteReference w:id="131"/>
-      </w:r>
-      <w:r>
-        <w:t xml:space="preserve"> </w:t>
-      </w:r>
-      <w:r>
-        <w:t xml:space="preserve">Earlier reports had described a good recovery, Gage later held a job driving coaches in Chile, and much of what is told about him is embellishment.</w:t>
-      </w:r>
-      <w:r>
-        <w:rPr>
-          <w:rStyle w:val="FootnoteReference"/>
-        </w:rPr>
-        <w:footnoteReference w:id="132"/>
+        <w:rPr>
+          <w:rStyle w:val="FootnoteReference"/>
+        </w:rPr>
+        <w:footnoteReference w:id="137"/>
+      </w:r>
+      <w:r>
+        <w:t xml:space="preserve"> </w:t>
+      </w:r>
+      <w:r>
+        <w:t xml:space="preserve">Earlier reports had described a good recovery, and in the years before Harlow wrote, Gage drove stagecoaches in Chile; much of what is told about him is embellishment.</w:t>
+      </w:r>
+      <w:r>
+        <w:rPr>
+          <w:rStyle w:val="FootnoteReference"/>
+        </w:rPr>
+        <w:footnoteReference w:id="138"/>
       </w:r>
       <w:r>
         <w:t xml:space="preserve"> </w:t>
@@ -2035,33 +2101,33 @@
         <w:rPr>
           <w:rStyle w:val="FootnoteReference"/>
         </w:rPr>
-        <w:footnoteReference w:id="133"/>
-      </w:r>
-    </w:p>
-    <w:p>
-      <w:pPr>
-        <w:pStyle w:val="BodyText"/>
-      </w:pPr>
-      <w:r>
-        <w:t xml:space="preserve">Antonio Damasio described a modern patient he called Elliot, who after surgery for a tumor in the same region scored normally on tests of intelligence and memory and could reason through a problem in detail, yet made one disastrous decision after another in his life and his business, recounting his losses with little feeling.</w:t>
-      </w:r>
-      <w:r>
-        <w:rPr>
-          <w:rStyle w:val="FootnoteReference"/>
-        </w:rPr>
-        <w:footnoteReference w:id="134"/>
-      </w:r>
-      <w:r>
-        <w:t xml:space="preserve"> </w:t>
-      </w:r>
-      <w:r>
-        <w:t xml:space="preserve">Damasio’s somatic marker hypothesis explains such cases: options that have led to good or bad outcomes come to evoke bodily states, the somatic markers, and anticipating these states biases choice before reasoning finishes.</w:t>
-      </w:r>
-      <w:r>
-        <w:rPr>
-          <w:rStyle w:val="FootnoteReference"/>
-        </w:rPr>
-        <w:footnoteReference w:id="135"/>
+        <w:footnoteReference w:id="139"/>
+      </w:r>
+    </w:p>
+    <w:p>
+      <w:pPr>
+        <w:pStyle w:val="BodyText"/>
+      </w:pPr>
+      <w:r>
+        <w:t xml:space="preserve">Antonio Damasio described a cleaner modern case, a patient he called Elliot, who after surgery for a tumor in the same region scored normally on tests of intelligence and memory and could reason through a problem in detail, yet made one disastrous decision after another in his life and his business, recounting his losses with little feeling.</w:t>
+      </w:r>
+      <w:r>
+        <w:rPr>
+          <w:rStyle w:val="FootnoteReference"/>
+        </w:rPr>
+        <w:footnoteReference w:id="140"/>
+      </w:r>
+      <w:r>
+        <w:t xml:space="preserve"> </w:t>
+      </w:r>
+      <w:r>
+        <w:t xml:space="preserve">Damasio proposed the somatic marker hypothesis to explain such cases: options that have led to good or bad outcomes come to evoke bodily states, the somatic markers, and anticipating these states biases choice before reasoning finishes.</w:t>
+      </w:r>
+      <w:r>
+        <w:rPr>
+          <w:rStyle w:val="FootnoteReference"/>
+        </w:rPr>
+        <w:footnoteReference w:id="141"/>
       </w:r>
     </w:p>
     <w:p>
@@ -2075,7 +2141,7 @@
         <w:rPr>
           <w:rStyle w:val="FootnoteReference"/>
         </w:rPr>
-        <w:footnoteReference w:id="136"/>
+        <w:footnoteReference w:id="142"/>
       </w:r>
     </w:p>
     <w:p>
@@ -2089,7 +2155,7 @@
         <w:rPr>
           <w:rStyle w:val="FootnoteReference"/>
         </w:rPr>
-        <w:footnoteReference w:id="137"/>
+        <w:footnoteReference w:id="143"/>
       </w:r>
     </w:p>
     <w:p>
@@ -2101,18 +2167,18 @@
           <wp:inline>
             <wp:extent cx="5943600" cy="2486379"/>
             <wp:effectExtent b="0" l="0" r="0" t="0"/>
-            <wp:docPr descr="Figure 7.7. The Iowa gambling task. A: the payoff schedule; decks A and B pay more per card but lose money over every ten cards, while decks C and D pay less and gain. B: illustrative choice curves; healthy players shift toward the good decks over a hundred trials, and patients with ventromedial prefrontal damage do not." title="" id="139" name="Picture"/>
+            <wp:docPr descr="Figure 7.7. The Iowa gambling task. A: the payoff schedule; decks A and B pay more per card but lose money over every ten cards, while decks C and D pay less and gain. B: illustrative choice curves; healthy players shift toward the good decks over a hundred trials, and patients with ventromedial prefrontal damage do not." title="" id="145" name="Picture"/>
             <a:graphic>
               <a:graphicData uri="http://schemas.openxmlformats.org/drawingml/2006/picture">
                 <pic:pic>
                   <pic:nvPicPr>
-                    <pic:cNvPr descr="images/fig_iowa_gambling.png" id="140" name="Picture"/>
+                    <pic:cNvPr descr="images/fig_iowa_gambling.png" id="146" name="Picture"/>
                     <pic:cNvPicPr>
                       <a:picLocks noChangeArrowheads="1" noChangeAspect="1"/>
                     </pic:cNvPicPr>
                   </pic:nvPicPr>
                   <pic:blipFill>
-                    <a:blip r:embed="rId138"/>
+                    <a:blip r:embed="rId144"/>
                     <a:stretch>
                       <a:fillRect/>
                     </a:stretch>
@@ -2152,13 +2218,13 @@
         <w:pStyle w:val="BodyText"/>
       </w:pPr>
       <w:r>
-        <w:t xml:space="preserve">The interpretation has not held up well. Tiago Maia and James McClelland asked players more detailed questions and found that they knew which decks were good about as soon as they began to choose them, so there is no clear period in which the body knows and the mind does not.</w:t>
-      </w:r>
-      <w:r>
-        <w:rPr>
-          <w:rStyle w:val="FootnoteReference"/>
-        </w:rPr>
-        <w:footnoteReference w:id="141"/>
+        <w:t xml:space="preserve">The interpretation has not held up well. Tiago Maia and James McClelland asked players more detailed questions and found that they knew which decks were good about as soon as they began to choose them; there is no clear period in which the body knows and the mind does not.</w:t>
+      </w:r>
+      <w:r>
+        <w:rPr>
+          <w:rStyle w:val="FootnoteReference"/>
+        </w:rPr>
+        <w:footnoteReference w:id="147"/>
       </w:r>
       <w:r>
         <w:t xml:space="preserve"> </w:t>
@@ -2170,19 +2236,19 @@
         <w:rPr>
           <w:rStyle w:val="FootnoteReference"/>
         </w:rPr>
-        <w:footnoteReference w:id="142"/>
-      </w:r>
-      <w:r>
-        <w:t xml:space="preserve"> </w:t>
-      </w:r>
-      <w:r>
-        <w:t xml:space="preserve">And Lesley Fellows and Martha Farah found that the patients’ difficulty is largely one of reversal learning: the bad decks pay well at first, and the patients fail to switch once they turn bad; when the early run of large rewards was removed, their deficit shrank.</w:t>
-      </w:r>
-      <w:r>
-        <w:rPr>
-          <w:rStyle w:val="FootnoteReference"/>
-        </w:rPr>
-        <w:footnoteReference w:id="143"/>
+        <w:footnoteReference w:id="148"/>
+      </w:r>
+      <w:r>
+        <w:t xml:space="preserve"> </w:t>
+      </w:r>
+      <w:r>
+        <w:t xml:space="preserve">And Lesley Fellows and Martha Farah found that the patients’ difficulty is largely one of reversal learning: the bad decks pay well at first, the patients fail to switch when they turn bad, and when the early run of large rewards was removed their deficit shrank.</w:t>
+      </w:r>
+      <w:r>
+        <w:rPr>
+          <w:rStyle w:val="FootnoteReference"/>
+        </w:rPr>
+        <w:footnoteReference w:id="149"/>
       </w:r>
       <w:r>
         <w:t xml:space="preserve"> </w:t>
@@ -2194,19 +2260,19 @@
         <w:rPr>
           <w:rStyle w:val="FootnoteReference"/>
         </w:rPr>
-        <w:footnoteReference w:id="144"/>
-      </w:r>
-    </w:p>
-    <w:p>
-      <w:pPr>
-        <w:pStyle w:val="BodyText"/>
-      </w:pPr>
-      <w:r>
-        <w:t xml:space="preserve">What survives is the finding that damage to the ventromedial prefrontal cortex leaves reasoning largely intact and choice impaired, and the observation that this region links value with the body, receiving interoceptive signals and sending commands to the hypothalamus and brainstem. Whether bodily feedback is needed for good choices is doubtful; that the value signals guiding choice are tied to the regulation of the body is not. How those signals are combined, weighed against uncertainty, and turned into a decision is the subject of Chapter 8.</w:t>
-      </w:r>
-    </w:p>
-    <w:bookmarkEnd w:id="145"/>
-    <w:bookmarkStart w:id="154" w:name="implications-for-artificial-intelligence"/>
+        <w:footnoteReference w:id="150"/>
+      </w:r>
+    </w:p>
+    <w:p>
+      <w:pPr>
+        <w:pStyle w:val="BodyText"/>
+      </w:pPr>
+      <w:r>
+        <w:t xml:space="preserve">What survives is that damage to the ventromedial prefrontal cortex leaves reasoning largely intact and choice impaired, and that this region links value with the body, receiving interoceptive signals and commanding the hypothalamus and brainstem. Whether bodily feedback is needed for good choices is doubtful; that the value signals guiding choice are tied to the regulation of the body is not. How those signals are combined, weighed against uncertainty, and turned into a decision is the subject of Chapter 8.</w:t>
+      </w:r>
+    </w:p>
+    <w:bookmarkEnd w:id="151"/>
+    <w:bookmarkStart w:id="160" w:name="implications-for-artificial-intelligence"/>
     <w:p>
       <w:pPr>
         <w:pStyle w:val="Heading1"/>
@@ -2228,13 +2294,13 @@
         <w:pStyle w:val="BodyText"/>
       </w:pPr>
       <w:r>
-        <w:t xml:space="preserve">First, value comes from outside. A reinforcement learning agent maximizes a reward that its designers specify. An animal’s rewards are not specified by anyone; they are generated by the state of its body, as Cabanac’s sweet solution showed, and they change as the state changes. Mehdi Keramati and Boris Gutkin formalized this in a model of homeostatic reinforcement learning, in which the reward for an outcome is the reduction it produces in the distance between the internal state and its set point, and showed that the model accounts for anticipatory responding and for the dependence of value on need.</w:t>
-      </w:r>
-      <w:r>
-        <w:rPr>
-          <w:rStyle w:val="FootnoteReference"/>
-        </w:rPr>
-        <w:footnoteReference w:id="146"/>
+        <w:t xml:space="preserve">First, value comes from outside. A reinforcement learning agent maximizes a reward that its designers specify. An animal’s rewards are generated by the state of its body, as Cabanac’s sweet solution showed, and change as the state changes. Mehdi Keramati and Boris Gutkin formalized this as homeostatic reinforcement learning, in which the reward for an outcome is the reduction it produces in the distance between the internal state and its set point, and showed that the model accounts for anticipatory responding and for the dependence of value on need.</w:t>
+      </w:r>
+      <w:r>
+        <w:rPr>
+          <w:rStyle w:val="FootnoteReference"/>
+        </w:rPr>
+        <w:footnoteReference w:id="152"/>
       </w:r>
       <w:r>
         <w:t xml:space="preserve"> </w:t>
@@ -2246,7 +2312,7 @@
         <w:rPr>
           <w:rStyle w:val="FootnoteReference"/>
         </w:rPr>
-        <w:footnoteReference w:id="147"/>
+        <w:footnoteReference w:id="153"/>
       </w:r>
     </w:p>
     <w:p>
@@ -2260,27 +2326,27 @@
         <w:rPr>
           <w:rStyle w:val="FootnoteReference"/>
         </w:rPr>
-        <w:footnoteReference w:id="148"/>
-      </w:r>
-      <w:r>
-        <w:t xml:space="preserve"> </w:t>
-      </w:r>
-      <w:r>
-        <w:t xml:space="preserve">Animals are not immune; addiction is a form of reward hacking. But an animal’s values are anchored to a body whose condition the brain must keep within bounds and cannot simply redefine, which constrains how far they can drift. Whether something like that anchoring can be built into an artificial agent, and whether it should be, is an open design question.</w:t>
-      </w:r>
-    </w:p>
-    <w:p>
-      <w:pPr>
-        <w:pStyle w:val="BodyText"/>
-      </w:pPr>
-      <w:r>
-        <w:t xml:space="preserve">Third, emotions are global modes. In 1967 Herbert Simon argued that any intelligent system that pursues goals serially in an uncertain world needs an interrupt mechanism that can seize control when something urgent happens, and that emotions are that mechanism in humans.</w:t>
-      </w:r>
-      <w:r>
-        <w:rPr>
-          <w:rStyle w:val="FootnoteReference"/>
-        </w:rPr>
-        <w:footnoteReference w:id="149"/>
+        <w:footnoteReference w:id="154"/>
+      </w:r>
+      <w:r>
+        <w:t xml:space="preserve"> </w:t>
+      </w:r>
+      <w:r>
+        <w:t xml:space="preserve">Animals are not immune; addiction is a form of reward hacking. But an animal’s values are anchored to a body that the brain must keep within bounds and cannot redefine, which limits how far they drift. Whether such anchoring can or should be built into an artificial agent is an open question.</w:t>
+      </w:r>
+    </w:p>
+    <w:p>
+      <w:pPr>
+        <w:pStyle w:val="BodyText"/>
+      </w:pPr>
+      <w:r>
+        <w:t xml:space="preserve">Third, emotions are global modes. In 1967 Herbert Simon argued that any system pursuing goals one at a time in an uncertain world needs an interrupt that can seize control when something urgent happens, and that emotions are that interrupt in humans.</w:t>
+      </w:r>
+      <w:r>
+        <w:rPr>
+          <w:rStyle w:val="FootnoteReference"/>
+        </w:rPr>
+        <w:footnoteReference w:id="155"/>
       </w:r>
       <w:r>
         <w:t xml:space="preserve"> </w:t>
@@ -2292,7 +2358,7 @@
         <w:rPr>
           <w:rStyle w:val="FootnoteReference"/>
         </w:rPr>
-        <w:footnoteReference w:id="150"/>
+        <w:footnoteReference w:id="156"/>
       </w:r>
       <w:r>
         <w:t xml:space="preserve"> </w:t>
@@ -2312,7 +2378,7 @@
         <w:rPr>
           <w:rStyle w:val="FootnoteReference"/>
         </w:rPr>
-        <w:footnoteReference w:id="151"/>
+        <w:footnoteReference w:id="157"/>
       </w:r>
       <w:r>
         <w:t xml:space="preserve"> </w:t>
@@ -2332,7 +2398,7 @@
         <w:rPr>
           <w:rStyle w:val="FootnoteReference"/>
         </w:rPr>
-        <w:footnoteReference w:id="152"/>
+        <w:footnoteReference w:id="158"/>
       </w:r>
       <w:r>
         <w:t xml:space="preserve"> </w:t>
@@ -2344,11 +2410,11 @@
         <w:rPr>
           <w:rStyle w:val="FootnoteReference"/>
         </w:rPr>
-        <w:footnoteReference w:id="153"/>
-      </w:r>
-    </w:p>
-    <w:bookmarkEnd w:id="154"/>
-    <w:bookmarkStart w:id="155" w:name="the-central-lesson"/>
+        <w:footnoteReference w:id="159"/>
+      </w:r>
+    </w:p>
+    <w:bookmarkEnd w:id="160"/>
+    <w:bookmarkStart w:id="161" w:name="the-central-lesson"/>
     <w:p>
       <w:pPr>
         <w:pStyle w:val="Heading1"/>
@@ -2362,11 +2428,11 @@
         <w:pStyle w:val="FirstParagraph"/>
       </w:pPr>
       <w:r>
-        <w:t xml:space="preserve">The brain’s first job is not to know the world but to keep a body alive in it, and emotion is how that job reaches every other. The brain regulates the body largely by prediction, and it senses the body as it senses the world, by combining what arrives with what is expected. The result, felt as valence and arousal and named, in people, as fear, anger, or relief, is an estimate of what the present situation means for the body. That estimate sets the value of every option, prepares the body through the autonomic and hormonal systems, and tells the plasticity of Chapter 5 what to keep. It is the part of the brain’s model that says what matters, and without it reason has nothing to work for.</w:t>
-      </w:r>
-    </w:p>
-    <w:bookmarkEnd w:id="155"/>
-    <w:bookmarkStart w:id="156" w:name="next-chapter"/>
+        <w:t xml:space="preserve">The brain’s first job is not to know the world but to keep a body alive in it, and emotion is how that job reaches every other. The brain regulates the body largely by prediction and senses it as it senses the world, by combining what arrives with what is expected. The result, felt as valence and arousal and named, in people, as fear, anger, or relief, is an estimate of what the present situation means for the body. That estimate sets the value of every option, prepares the body, and tells the plasticity of Chapter 5 what to keep. It is the part of the brain’s model that says what matters, and without it reason has nothing to work for.</w:t>
+      </w:r>
+    </w:p>
+    <w:bookmarkEnd w:id="161"/>
+    <w:bookmarkStart w:id="162" w:name="next-chapter"/>
     <w:p>
       <w:pPr>
         <w:pStyle w:val="Heading1"/>
@@ -2383,8 +2449,8 @@
         <w:t xml:space="preserve">Chapter 8: Decision-Making Under Uncertainty: How the Brain Chooses When It Cannot Be Sure</w:t>
       </w:r>
     </w:p>
-    <w:bookmarkEnd w:id="156"/>
-    <w:bookmarkStart w:id="160" w:name="references-and-attribution"/>
+    <w:bookmarkEnd w:id="162"/>
+    <w:bookmarkStart w:id="166" w:name="references-and-attribution"/>
     <w:p>
       <w:pPr>
         <w:pStyle w:val="Heading1"/>
@@ -2393,7 +2459,7 @@
         <w:t xml:space="preserve">References and Attribution</w:t>
       </w:r>
     </w:p>
-    <w:bookmarkStart w:id="157" w:name="figure-attribution"/>
+    <w:bookmarkStart w:id="163" w:name="figure-attribution"/>
     <w:p>
       <w:pPr>
         <w:pStyle w:val="Heading2"/>
@@ -2410,8 +2476,8 @@
         <w:t xml:space="preserve">Figures 7.1 to 7.7 were drawn for this book. The glucose traces in Figure 7.1, the curves in Figure 7.6, and the choice curves in Figure 7.7B are illustrative computations, not recorded data; the positions of emotion words in Figure 7.3 are approximate. The payoff schedule in Figure 7.7A follows Bechara and colleagues (1994).</w:t>
       </w:r>
     </w:p>
-    <w:bookmarkEnd w:id="157"/>
-    <w:bookmarkStart w:id="158" w:name="epigraph"/>
+    <w:bookmarkEnd w:id="163"/>
+    <w:bookmarkStart w:id="164" w:name="epigraph"/>
     <w:p>
       <w:pPr>
         <w:pStyle w:val="Heading2"/>
@@ -2456,8 +2522,8 @@
         <w:t xml:space="preserve">, 9(34), 188–205 (1884).</w:t>
       </w:r>
     </w:p>
-    <w:bookmarkEnd w:id="158"/>
-    <w:bookmarkStart w:id="159" w:name="references"/>
+    <w:bookmarkEnd w:id="164"/>
+    <w:bookmarkStart w:id="165" w:name="references"/>
     <w:p>
       <w:pPr>
         <w:pStyle w:val="Heading2"/>
@@ -2975,6 +3041,69 @@
         <w:pStyle w:val="BodyText"/>
       </w:pPr>
       <w:r>
+        <w:t xml:space="preserve">Chwalisz, K., Diener, E., &amp; Gallagher, D. (1988). Autonomic arousal feedback and emotional experience: Evidence from the spinal cord injured.</w:t>
+      </w:r>
+      <w:r>
+        <w:t xml:space="preserve"> </w:t>
+      </w:r>
+      <w:r>
+        <w:rPr>
+          <w:iCs/>
+          <w:i/>
+        </w:rPr>
+        <w:t xml:space="preserve">Journal of Personality and Social Psychology</w:t>
+      </w:r>
+      <w:r>
+        <w:t xml:space="preserve">, 54(5), 820–828.</w:t>
+      </w:r>
+    </w:p>
+    <w:p>
+      <w:pPr>
+        <w:pStyle w:val="BodyText"/>
+      </w:pPr>
+      <w:r>
+        <w:t xml:space="preserve">Coan, J. A., Schaefer, H. S., &amp; Davidson, R. J. (2006). Lending a hand: Social regulation of the neural response to threat.</w:t>
+      </w:r>
+      <w:r>
+        <w:t xml:space="preserve"> </w:t>
+      </w:r>
+      <w:r>
+        <w:rPr>
+          <w:iCs/>
+          <w:i/>
+        </w:rPr>
+        <w:t xml:space="preserve">Psychological Science</w:t>
+      </w:r>
+      <w:r>
+        <w:t xml:space="preserve">, 17(12), 1032–1039.</w:t>
+      </w:r>
+    </w:p>
+    <w:p>
+      <w:pPr>
+        <w:pStyle w:val="BodyText"/>
+      </w:pPr>
+      <w:r>
+        <w:t xml:space="preserve">Coles, N. A., Larsen, J. T., &amp; Lench, H. C. (2019). A meta-analysis of the facial feedback literature: Effects of facial feedback on emotional experience are small and variable.</w:t>
+      </w:r>
+      <w:r>
+        <w:t xml:space="preserve"> </w:t>
+      </w:r>
+      <w:r>
+        <w:rPr>
+          <w:iCs/>
+          <w:i/>
+        </w:rPr>
+        <w:t xml:space="preserve">Psychological Bulletin</w:t>
+      </w:r>
+      <w:r>
+        <w:t xml:space="preserve">, 145(6), 610–651.</w:t>
+      </w:r>
+    </w:p>
+    <w:p>
+      <w:pPr>
+        <w:pStyle w:val="BodyText"/>
+      </w:pPr>
+      <w:r>
         <w:t xml:space="preserve">Craig, A. D. (2002). How do you feel? Interoception: The sense of the physiological condition of the body.</w:t>
       </w:r>
       <w:r>
@@ -3101,6 +3230,48 @@
         <w:pStyle w:val="BodyText"/>
       </w:pPr>
       <w:r>
+        <w:t xml:space="preserve">Davis, M., Walker, D. L., Miles, L., &amp; Grillon, C. (2010). Phasic vs sustained fear in rats and humans: Role of the extended amygdala in fear vs anxiety.</w:t>
+      </w:r>
+      <w:r>
+        <w:t xml:space="preserve"> </w:t>
+      </w:r>
+      <w:r>
+        <w:rPr>
+          <w:iCs/>
+          <w:i/>
+        </w:rPr>
+        <w:t xml:space="preserve">Neuropsychopharmacology</w:t>
+      </w:r>
+      <w:r>
+        <w:t xml:space="preserve">, 35(1), 105–135.</w:t>
+      </w:r>
+    </w:p>
+    <w:p>
+      <w:pPr>
+        <w:pStyle w:val="BodyText"/>
+      </w:pPr>
+      <w:r>
+        <w:t xml:space="preserve">de Kloet, E. R., Joëls, M., &amp; Holsboer, F. (2005). Stress and the brain: From adaptation to disease.</w:t>
+      </w:r>
+      <w:r>
+        <w:t xml:space="preserve"> </w:t>
+      </w:r>
+      <w:r>
+        <w:rPr>
+          <w:iCs/>
+          <w:i/>
+        </w:rPr>
+        <w:t xml:space="preserve">Nature Reviews Neuroscience</w:t>
+      </w:r>
+      <w:r>
+        <w:t xml:space="preserve">, 6(6), 463–475.</w:t>
+      </w:r>
+    </w:p>
+    <w:p>
+      <w:pPr>
+        <w:pStyle w:val="BodyText"/>
+      </w:pPr>
+      <w:r>
         <w:t xml:space="preserve">Doya, K. (2002). Metalearning and neuromodulation.</w:t>
       </w:r>
       <w:r>
@@ -3755,6 +3926,27 @@
         <w:pStyle w:val="BodyText"/>
       </w:pPr>
       <w:r>
+        <w:t xml:space="preserve">Liu, D., Diorio, J., Tannenbaum, B., Caldji, C., Francis, D., Freedman, A., Sharma, S., Pearson, D., Plotsky, P. M., &amp; Meaney, M. J. (1997). Maternal care, hippocampal glucocorticoid receptors, and hypothalamic-pituitary-adrenal responses to stress.</w:t>
+      </w:r>
+      <w:r>
+        <w:t xml:space="preserve"> </w:t>
+      </w:r>
+      <w:r>
+        <w:rPr>
+          <w:iCs/>
+          <w:i/>
+        </w:rPr>
+        <w:t xml:space="preserve">Science</w:t>
+      </w:r>
+      <w:r>
+        <w:t xml:space="preserve">, 277(5332), 1659–1662.</w:t>
+      </w:r>
+    </w:p>
+    <w:p>
+      <w:pPr>
+        <w:pStyle w:val="BodyText"/>
+      </w:pPr>
+      <w:r>
         <w:t xml:space="preserve">Macmillan, M. (2000).</w:t>
       </w:r>
       <w:r>
@@ -4676,6 +4868,48 @@
         <w:pStyle w:val="BodyText"/>
       </w:pPr>
       <w:r>
+        <w:t xml:space="preserve">Wagenmakers, E.-J., Beek, T., Dijkhoff, L., Gronau, Q. F., Acosta, A., Adams, R. B., Jr., … Zwaan, R. A. (2016). Registered replication report: Strack, Martin, &amp; Stepper (1988).</w:t>
+      </w:r>
+      <w:r>
+        <w:t xml:space="preserve"> </w:t>
+      </w:r>
+      <w:r>
+        <w:rPr>
+          <w:iCs/>
+          <w:i/>
+        </w:rPr>
+        <w:t xml:space="preserve">Perspectives on Psychological Science</w:t>
+      </w:r>
+      <w:r>
+        <w:t xml:space="preserve">, 11(6), 917–928.</w:t>
+      </w:r>
+    </w:p>
+    <w:p>
+      <w:pPr>
+        <w:pStyle w:val="BodyText"/>
+      </w:pPr>
+      <w:r>
+        <w:t xml:space="preserve">Williams, C. L., &amp; McGaugh, J. L. (1993). Reversible lesions of the nucleus of the solitary tract attenuate the memory-modulating effects of posttraining epinephrine.</w:t>
+      </w:r>
+      <w:r>
+        <w:t xml:space="preserve"> </w:t>
+      </w:r>
+      <w:r>
+        <w:rPr>
+          <w:iCs/>
+          <w:i/>
+        </w:rPr>
+        <w:t xml:space="preserve">Behavioral Neuroscience</w:t>
+      </w:r>
+      <w:r>
+        <w:t xml:space="preserve">, 107(6), 955–962.</w:t>
+      </w:r>
+    </w:p>
+    <w:p>
+      <w:pPr>
+        <w:pStyle w:val="BodyText"/>
+      </w:pPr>
+      <w:r>
         <w:t xml:space="preserve">Woods, S. C. (1991). The eating paradox: How we tolerate food.</w:t>
       </w:r>
       <w:r>
@@ -4713,8 +4947,8 @@
         <w:t xml:space="preserve">, 18(5), 459–482.</w:t>
       </w:r>
     </w:p>
-    <w:bookmarkEnd w:id="159"/>
-    <w:bookmarkEnd w:id="160"/>
+    <w:bookmarkEnd w:id="165"/>
+    <w:bookmarkEnd w:id="166"/>
     <w:sectPr>
       <w:pgSz w:h="15840" w:w="12240"/>
       <w:pgMar w:bottom="1440" w:left="1440" w:right="1440" w:top="1440"/>
@@ -5778,6 +6012,83 @@
         <w:t xml:space="preserve"> </w:t>
       </w:r>
       <w:r>
+        <w:t xml:space="preserve">Chwalisz, K., Diener, E., &amp; Gallagher, D. (1988). Autonomic arousal feedback and emotional experience: Evidence from the spinal cord injured.</w:t>
+      </w:r>
+      <w:r>
+        <w:t xml:space="preserve"> </w:t>
+      </w:r>
+      <w:r>
+        <w:rPr>
+          <w:iCs/>
+          <w:i/>
+        </w:rPr>
+        <w:t xml:space="preserve">Journal of Personality and Social Psychology</w:t>
+      </w:r>
+      <w:r>
+        <w:t xml:space="preserve">, 54(5), 820–828.</w:t>
+      </w:r>
+    </w:p>
+  </w:footnote>
+  <w:footnote w:id="60">
+    <w:p>
+      <w:pPr>
+        <w:pStyle w:val="FootnoteText"/>
+      </w:pPr>
+      <w:r>
+        <w:rPr>
+          <w:rStyle w:val="FootnoteReference"/>
+        </w:rPr>
+        <w:footnoteRef/>
+      </w:r>
+      <w:r>
+        <w:t xml:space="preserve"> </w:t>
+      </w:r>
+      <w:r>
+        <w:t xml:space="preserve">Wagenmakers, E.-J., Beek, T., Dijkhoff, L., Gronau, Q. F., Acosta, A., Adams, R. B., Jr., … Zwaan, R. A. (2016). Registered replication report: Strack, Martin, &amp; Stepper (1988).</w:t>
+      </w:r>
+      <w:r>
+        <w:t xml:space="preserve"> </w:t>
+      </w:r>
+      <w:r>
+        <w:rPr>
+          <w:iCs/>
+          <w:i/>
+        </w:rPr>
+        <w:t xml:space="preserve">Perspectives on Psychological Science</w:t>
+      </w:r>
+      <w:r>
+        <w:t xml:space="preserve">, 11(6), 917–928; Coles, N. A., Larsen, J. T., &amp; Lench, H. C. (2019). A meta-analysis of the facial feedback literature: Effects of facial feedback on emotional experience are small and variable.</w:t>
+      </w:r>
+      <w:r>
+        <w:t xml:space="preserve"> </w:t>
+      </w:r>
+      <w:r>
+        <w:rPr>
+          <w:iCs/>
+          <w:i/>
+        </w:rPr>
+        <w:t xml:space="preserve">Psychological Bulletin</w:t>
+      </w:r>
+      <w:r>
+        <w:t xml:space="preserve">, 145(6), 610–651.</w:t>
+      </w:r>
+    </w:p>
+  </w:footnote>
+  <w:footnote w:id="61">
+    <w:p>
+      <w:pPr>
+        <w:pStyle w:val="FootnoteText"/>
+      </w:pPr>
+      <w:r>
+        <w:rPr>
+          <w:rStyle w:val="FootnoteReference"/>
+        </w:rPr>
+        <w:footnoteRef/>
+      </w:r>
+      <w:r>
+        <w:t xml:space="preserve"> </w:t>
+      </w:r>
+      <w:r>
         <w:t xml:space="preserve">Schachter, S., &amp; Singer, J. E. (1962). Cognitive, social, and physiological determinants of emotional state.</w:t>
       </w:r>
       <w:r>
@@ -5795,7 +6106,7 @@
       </w:r>
     </w:p>
   </w:footnote>
-  <w:footnote w:id="60">
+  <w:footnote w:id="62">
     <w:p>
       <w:pPr>
         <w:pStyle w:val="FootnoteText"/>
@@ -5827,7 +6138,7 @@
       </w:r>
     </w:p>
   </w:footnote>
-  <w:footnote w:id="61">
+  <w:footnote w:id="63">
     <w:p>
       <w:pPr>
         <w:pStyle w:val="FootnoteText"/>
@@ -5859,7 +6170,7 @@
       </w:r>
     </w:p>
   </w:footnote>
-  <w:footnote w:id="62">
+  <w:footnote w:id="64">
     <w:p>
       <w:pPr>
         <w:pStyle w:val="FootnoteText"/>
@@ -5891,7 +6202,7 @@
       </w:r>
     </w:p>
   </w:footnote>
-  <w:footnote w:id="63">
+  <w:footnote w:id="65">
     <w:p>
       <w:pPr>
         <w:pStyle w:val="FootnoteText"/>
@@ -5923,7 +6234,7 @@
       </w:r>
     </w:p>
   </w:footnote>
-  <w:footnote w:id="64">
+  <w:footnote w:id="66">
     <w:p>
       <w:pPr>
         <w:pStyle w:val="FootnoteText"/>
@@ -5955,7 +6266,7 @@
       </w:r>
     </w:p>
   </w:footnote>
-  <w:footnote w:id="65">
+  <w:footnote w:id="67">
     <w:p>
       <w:pPr>
         <w:pStyle w:val="FootnoteText"/>
@@ -5987,7 +6298,7 @@
       </w:r>
     </w:p>
   </w:footnote>
-  <w:footnote w:id="66">
+  <w:footnote w:id="68">
     <w:p>
       <w:pPr>
         <w:pStyle w:val="FootnoteText"/>
@@ -6032,7 +6343,7 @@
       </w:r>
     </w:p>
   </w:footnote>
-  <w:footnote w:id="67">
+  <w:footnote w:id="69">
     <w:p>
       <w:pPr>
         <w:pStyle w:val="FootnoteText"/>
@@ -6064,7 +6375,7 @@
       </w:r>
     </w:p>
   </w:footnote>
-  <w:footnote w:id="72">
+  <w:footnote w:id="74">
     <w:p>
       <w:pPr>
         <w:pStyle w:val="FootnoteText"/>
@@ -6096,7 +6407,7 @@
       </w:r>
     </w:p>
   </w:footnote>
-  <w:footnote w:id="73">
+  <w:footnote w:id="75">
     <w:p>
       <w:pPr>
         <w:pStyle w:val="FootnoteText"/>
@@ -6128,7 +6439,7 @@
       </w:r>
     </w:p>
   </w:footnote>
-  <w:footnote w:id="74">
+  <w:footnote w:id="76">
     <w:p>
       <w:pPr>
         <w:pStyle w:val="FootnoteText"/>
@@ -6160,7 +6471,7 @@
       </w:r>
     </w:p>
   </w:footnote>
-  <w:footnote w:id="75">
+  <w:footnote w:id="77">
     <w:p>
       <w:pPr>
         <w:pStyle w:val="FootnoteText"/>
@@ -6192,7 +6503,7 @@
       </w:r>
     </w:p>
   </w:footnote>
-  <w:footnote w:id="77">
+  <w:footnote w:id="79">
     <w:p>
       <w:pPr>
         <w:pStyle w:val="FootnoteText"/>
@@ -6224,7 +6535,7 @@
       </w:r>
     </w:p>
   </w:footnote>
-  <w:footnote w:id="78">
+  <w:footnote w:id="80">
     <w:p>
       <w:pPr>
         <w:pStyle w:val="FootnoteText"/>
@@ -6256,7 +6567,7 @@
       </w:r>
     </w:p>
   </w:footnote>
-  <w:footnote w:id="79">
+  <w:footnote w:id="81">
     <w:p>
       <w:pPr>
         <w:pStyle w:val="FootnoteText"/>
@@ -6301,7 +6612,7 @@
       </w:r>
     </w:p>
   </w:footnote>
-  <w:footnote w:id="83">
+  <w:footnote w:id="85">
     <w:p>
       <w:pPr>
         <w:pStyle w:val="FootnoteText"/>
@@ -6333,7 +6644,7 @@
       </w:r>
     </w:p>
   </w:footnote>
-  <w:footnote w:id="84">
+  <w:footnote w:id="86">
     <w:p>
       <w:pPr>
         <w:pStyle w:val="FootnoteText"/>
@@ -6401,7 +6712,7 @@
       </w:r>
     </w:p>
   </w:footnote>
-  <w:footnote w:id="85">
+  <w:footnote w:id="87">
     <w:p>
       <w:pPr>
         <w:pStyle w:val="FootnoteText"/>
@@ -6433,7 +6744,7 @@
       </w:r>
     </w:p>
   </w:footnote>
-  <w:footnote w:id="86">
+  <w:footnote w:id="88">
     <w:p>
       <w:pPr>
         <w:pStyle w:val="FootnoteText"/>
@@ -6465,7 +6776,7 @@
       </w:r>
     </w:p>
   </w:footnote>
-  <w:footnote w:id="87">
+  <w:footnote w:id="89">
     <w:p>
       <w:pPr>
         <w:pStyle w:val="FootnoteText"/>
@@ -6497,7 +6808,39 @@
       </w:r>
     </w:p>
   </w:footnote>
-  <w:footnote w:id="88">
+  <w:footnote w:id="90">
+    <w:p>
+      <w:pPr>
+        <w:pStyle w:val="FootnoteText"/>
+      </w:pPr>
+      <w:r>
+        <w:rPr>
+          <w:rStyle w:val="FootnoteReference"/>
+        </w:rPr>
+        <w:footnoteRef/>
+      </w:r>
+      <w:r>
+        <w:t xml:space="preserve"> </w:t>
+      </w:r>
+      <w:r>
+        <w:t xml:space="preserve">Davis, M., Walker, D. L., Miles, L., &amp; Grillon, C. (2010). Phasic vs sustained fear in rats and humans: Role of the extended amygdala in fear vs anxiety.</w:t>
+      </w:r>
+      <w:r>
+        <w:t xml:space="preserve"> </w:t>
+      </w:r>
+      <w:r>
+        <w:rPr>
+          <w:iCs/>
+          <w:i/>
+        </w:rPr>
+        <w:t xml:space="preserve">Neuropsychopharmacology</w:t>
+      </w:r>
+      <w:r>
+        <w:t xml:space="preserve">, 35(1), 105–135.</w:t>
+      </w:r>
+    </w:p>
+  </w:footnote>
+  <w:footnote w:id="91">
     <w:p>
       <w:pPr>
         <w:pStyle w:val="FootnoteText"/>
@@ -6529,7 +6872,7 @@
       </w:r>
     </w:p>
   </w:footnote>
-  <w:footnote w:id="89">
+  <w:footnote w:id="92">
     <w:p>
       <w:pPr>
         <w:pStyle w:val="FootnoteText"/>
@@ -6561,7 +6904,7 @@
       </w:r>
     </w:p>
   </w:footnote>
-  <w:footnote w:id="91">
+  <w:footnote w:id="94">
     <w:p>
       <w:pPr>
         <w:pStyle w:val="FootnoteText"/>
@@ -6593,7 +6936,7 @@
       </w:r>
     </w:p>
   </w:footnote>
-  <w:footnote w:id="92">
+  <w:footnote w:id="95">
     <w:p>
       <w:pPr>
         <w:pStyle w:val="FootnoteText"/>
@@ -6625,7 +6968,7 @@
       </w:r>
     </w:p>
   </w:footnote>
-  <w:footnote w:id="93">
+  <w:footnote w:id="96">
     <w:p>
       <w:pPr>
         <w:pStyle w:val="FootnoteText"/>
@@ -6657,7 +7000,7 @@
       </w:r>
     </w:p>
   </w:footnote>
-  <w:footnote w:id="94">
+  <w:footnote w:id="97">
     <w:p>
       <w:pPr>
         <w:pStyle w:val="FootnoteText"/>
@@ -6689,7 +7032,7 @@
       </w:r>
     </w:p>
   </w:footnote>
-  <w:footnote w:id="95">
+  <w:footnote w:id="98">
     <w:p>
       <w:pPr>
         <w:pStyle w:val="FootnoteText"/>
@@ -6721,7 +7064,7 @@
       </w:r>
     </w:p>
   </w:footnote>
-  <w:footnote w:id="97">
+  <w:footnote w:id="100">
     <w:p>
       <w:pPr>
         <w:pStyle w:val="FootnoteText"/>
@@ -6753,7 +7096,7 @@
       </w:r>
     </w:p>
   </w:footnote>
-  <w:footnote w:id="101">
+  <w:footnote w:id="104">
     <w:p>
       <w:pPr>
         <w:pStyle w:val="FootnoteText"/>
@@ -6785,7 +7128,7 @@
       </w:r>
     </w:p>
   </w:footnote>
-  <w:footnote w:id="102">
+  <w:footnote w:id="105">
     <w:p>
       <w:pPr>
         <w:pStyle w:val="FootnoteText"/>
@@ -6817,7 +7160,7 @@
       </w:r>
     </w:p>
   </w:footnote>
-  <w:footnote w:id="103">
+  <w:footnote w:id="106">
     <w:p>
       <w:pPr>
         <w:pStyle w:val="FootnoteText"/>
@@ -6849,7 +7192,71 @@
       </w:r>
     </w:p>
   </w:footnote>
-  <w:footnote w:id="104">
+  <w:footnote w:id="107">
+    <w:p>
+      <w:pPr>
+        <w:pStyle w:val="FootnoteText"/>
+      </w:pPr>
+      <w:r>
+        <w:rPr>
+          <w:rStyle w:val="FootnoteReference"/>
+        </w:rPr>
+        <w:footnoteRef/>
+      </w:r>
+      <w:r>
+        <w:t xml:space="preserve"> </w:t>
+      </w:r>
+      <w:r>
+        <w:t xml:space="preserve">Liu, D., Diorio, J., Tannenbaum, B., Caldji, C., Francis, D., Freedman, A., Sharma, S., Pearson, D., Plotsky, P. M., &amp; Meaney, M. J. (1997). Maternal care, hippocampal glucocorticoid receptors, and hypothalamic-pituitary-adrenal responses to stress.</w:t>
+      </w:r>
+      <w:r>
+        <w:t xml:space="preserve"> </w:t>
+      </w:r>
+      <w:r>
+        <w:rPr>
+          <w:iCs/>
+          <w:i/>
+        </w:rPr>
+        <w:t xml:space="preserve">Science</w:t>
+      </w:r>
+      <w:r>
+        <w:t xml:space="preserve">, 277(5332), 1659–1662.</w:t>
+      </w:r>
+    </w:p>
+  </w:footnote>
+  <w:footnote w:id="108">
+    <w:p>
+      <w:pPr>
+        <w:pStyle w:val="FootnoteText"/>
+      </w:pPr>
+      <w:r>
+        <w:rPr>
+          <w:rStyle w:val="FootnoteReference"/>
+        </w:rPr>
+        <w:footnoteRef/>
+      </w:r>
+      <w:r>
+        <w:t xml:space="preserve"> </w:t>
+      </w:r>
+      <w:r>
+        <w:t xml:space="preserve">Coan, J. A., Schaefer, H. S., &amp; Davidson, R. J. (2006). Lending a hand: Social regulation of the neural response to threat.</w:t>
+      </w:r>
+      <w:r>
+        <w:t xml:space="preserve"> </w:t>
+      </w:r>
+      <w:r>
+        <w:rPr>
+          <w:iCs/>
+          <w:i/>
+        </w:rPr>
+        <w:t xml:space="preserve">Psychological Science</w:t>
+      </w:r>
+      <w:r>
+        <w:t xml:space="preserve">, 17(12), 1032–1039.</w:t>
+      </w:r>
+    </w:p>
+  </w:footnote>
+  <w:footnote w:id="109">
     <w:p>
       <w:pPr>
         <w:pStyle w:val="FootnoteText"/>
@@ -6881,7 +7288,7 @@
       </w:r>
     </w:p>
   </w:footnote>
-  <w:footnote w:id="105">
+  <w:footnote w:id="110">
     <w:p>
       <w:pPr>
         <w:pStyle w:val="FootnoteText"/>
@@ -6913,7 +7320,39 @@
       </w:r>
     </w:p>
   </w:footnote>
-  <w:footnote w:id="109">
+  <w:footnote w:id="111">
+    <w:p>
+      <w:pPr>
+        <w:pStyle w:val="FootnoteText"/>
+      </w:pPr>
+      <w:r>
+        <w:rPr>
+          <w:rStyle w:val="FootnoteReference"/>
+        </w:rPr>
+        <w:footnoteRef/>
+      </w:r>
+      <w:r>
+        <w:t xml:space="preserve"> </w:t>
+      </w:r>
+      <w:r>
+        <w:t xml:space="preserve">de Kloet, E. R., Joëls, M., &amp; Holsboer, F. (2005). Stress and the brain: From adaptation to disease.</w:t>
+      </w:r>
+      <w:r>
+        <w:t xml:space="preserve"> </w:t>
+      </w:r>
+      <w:r>
+        <w:rPr>
+          <w:iCs/>
+          <w:i/>
+        </w:rPr>
+        <w:t xml:space="preserve">Nature Reviews Neuroscience</w:t>
+      </w:r>
+      <w:r>
+        <w:t xml:space="preserve">, 6(6), 463–475.</w:t>
+      </w:r>
+    </w:p>
+  </w:footnote>
+  <w:footnote w:id="115">
     <w:p>
       <w:pPr>
         <w:pStyle w:val="FootnoteText"/>
@@ -6958,7 +7397,7 @@
       </w:r>
     </w:p>
   </w:footnote>
-  <w:footnote w:id="110">
+  <w:footnote w:id="116">
     <w:p>
       <w:pPr>
         <w:pStyle w:val="FootnoteText"/>
@@ -6990,7 +7429,7 @@
       </w:r>
     </w:p>
   </w:footnote>
-  <w:footnote w:id="111">
+  <w:footnote w:id="117">
     <w:p>
       <w:pPr>
         <w:pStyle w:val="FootnoteText"/>
@@ -7022,7 +7461,7 @@
       </w:r>
     </w:p>
   </w:footnote>
-  <w:footnote w:id="112">
+  <w:footnote w:id="118">
     <w:p>
       <w:pPr>
         <w:pStyle w:val="FootnoteText"/>
@@ -7067,7 +7506,7 @@
       </w:r>
     </w:p>
   </w:footnote>
-  <w:footnote w:id="114">
+  <w:footnote w:id="120">
     <w:p>
       <w:pPr>
         <w:pStyle w:val="FootnoteText"/>
@@ -7099,7 +7538,7 @@
       </w:r>
     </w:p>
   </w:footnote>
-  <w:footnote w:id="115">
+  <w:footnote w:id="121">
     <w:p>
       <w:pPr>
         <w:pStyle w:val="FootnoteText"/>
@@ -7131,7 +7570,7 @@
       </w:r>
     </w:p>
   </w:footnote>
-  <w:footnote w:id="116">
+  <w:footnote w:id="122">
     <w:p>
       <w:pPr>
         <w:pStyle w:val="FootnoteText"/>
@@ -7163,7 +7602,7 @@
       </w:r>
     </w:p>
   </w:footnote>
-  <w:footnote w:id="117">
+  <w:footnote w:id="123">
     <w:p>
       <w:pPr>
         <w:pStyle w:val="FootnoteText"/>
@@ -7195,7 +7634,7 @@
       </w:r>
     </w:p>
   </w:footnote>
-  <w:footnote w:id="118">
+  <w:footnote w:id="124">
     <w:p>
       <w:pPr>
         <w:pStyle w:val="FootnoteText"/>
@@ -7227,7 +7666,7 @@
       </w:r>
     </w:p>
   </w:footnote>
-  <w:footnote w:id="119">
+  <w:footnote w:id="125">
     <w:p>
       <w:pPr>
         <w:pStyle w:val="FootnoteText"/>
@@ -7259,7 +7698,7 @@
       </w:r>
     </w:p>
   </w:footnote>
-  <w:footnote w:id="120">
+  <w:footnote w:id="126">
     <w:p>
       <w:pPr>
         <w:pStyle w:val="FootnoteText"/>
@@ -7291,7 +7730,7 @@
       </w:r>
     </w:p>
   </w:footnote>
-  <w:footnote w:id="122">
+  <w:footnote w:id="128">
     <w:p>
       <w:pPr>
         <w:pStyle w:val="FootnoteText"/>
@@ -7323,7 +7762,7 @@
       </w:r>
     </w:p>
   </w:footnote>
-  <w:footnote w:id="123">
+  <w:footnote w:id="129">
     <w:p>
       <w:pPr>
         <w:pStyle w:val="FootnoteText"/>
@@ -7355,22 +7794,35 @@
       </w:r>
     </w:p>
   </w:footnote>
-  <w:footnote w:id="124">
-    <w:p>
-      <w:pPr>
-        <w:pStyle w:val="FootnoteText"/>
-      </w:pPr>
-      <w:r>
-        <w:rPr>
-          <w:rStyle w:val="FootnoteReference"/>
-        </w:rPr>
-        <w:footnoteRef/>
-      </w:r>
-      <w:r>
-        <w:t xml:space="preserve"> </w:t>
-      </w:r>
-      <w:r>
-        <w:t xml:space="preserve">McGaugh, J. L. (2004). The amygdala modulates the consolidation of memories of emotionally arousing experiences.</w:t>
+  <w:footnote w:id="130">
+    <w:p>
+      <w:pPr>
+        <w:pStyle w:val="FootnoteText"/>
+      </w:pPr>
+      <w:r>
+        <w:rPr>
+          <w:rStyle w:val="FootnoteReference"/>
+        </w:rPr>
+        <w:footnoteRef/>
+      </w:r>
+      <w:r>
+        <w:t xml:space="preserve"> </w:t>
+      </w:r>
+      <w:r>
+        <w:t xml:space="preserve">Williams, C. L., &amp; McGaugh, J. L. (1993). Reversible lesions of the nucleus of the solitary tract attenuate the memory-modulating effects of posttraining epinephrine.</w:t>
+      </w:r>
+      <w:r>
+        <w:t xml:space="preserve"> </w:t>
+      </w:r>
+      <w:r>
+        <w:rPr>
+          <w:iCs/>
+          <w:i/>
+        </w:rPr>
+        <w:t xml:space="preserve">Behavioral Neuroscience</w:t>
+      </w:r>
+      <w:r>
+        <w:t xml:space="preserve">, 107(6), 955–962; McGaugh, J. L. (2004). The amygdala modulates the consolidation of memories of emotionally arousing experiences.</w:t>
       </w:r>
       <w:r>
         <w:t xml:space="preserve"> </w:t>
@@ -7387,7 +7839,7 @@
       </w:r>
     </w:p>
   </w:footnote>
-  <w:footnote w:id="125">
+  <w:footnote w:id="131">
     <w:p>
       <w:pPr>
         <w:pStyle w:val="FootnoteText"/>
@@ -7419,7 +7871,7 @@
       </w:r>
     </w:p>
   </w:footnote>
-  <w:footnote w:id="126">
+  <w:footnote w:id="132">
     <w:p>
       <w:pPr>
         <w:pStyle w:val="FootnoteText"/>
@@ -7451,7 +7903,7 @@
       </w:r>
     </w:p>
   </w:footnote>
-  <w:footnote w:id="127">
+  <w:footnote w:id="133">
     <w:p>
       <w:pPr>
         <w:pStyle w:val="FootnoteText"/>
@@ -7483,7 +7935,7 @@
       </w:r>
     </w:p>
   </w:footnote>
-  <w:footnote w:id="128">
+  <w:footnote w:id="134">
     <w:p>
       <w:pPr>
         <w:pStyle w:val="FootnoteText"/>
@@ -7560,7 +8012,7 @@
       </w:r>
     </w:p>
   </w:footnote>
-  <w:footnote w:id="129">
+  <w:footnote w:id="135">
     <w:p>
       <w:pPr>
         <w:pStyle w:val="FootnoteText"/>
@@ -7592,7 +8044,7 @@
       </w:r>
     </w:p>
   </w:footnote>
-  <w:footnote w:id="131">
+  <w:footnote w:id="137">
     <w:p>
       <w:pPr>
         <w:pStyle w:val="FootnoteText"/>
@@ -7624,7 +8076,7 @@
       </w:r>
     </w:p>
   </w:footnote>
-  <w:footnote w:id="132">
+  <w:footnote w:id="138">
     <w:p>
       <w:pPr>
         <w:pStyle w:val="FootnoteText"/>
@@ -7656,7 +8108,7 @@
       </w:r>
     </w:p>
   </w:footnote>
-  <w:footnote w:id="133">
+  <w:footnote w:id="139">
     <w:p>
       <w:pPr>
         <w:pStyle w:val="FootnoteText"/>
@@ -7701,7 +8153,7 @@
       </w:r>
     </w:p>
   </w:footnote>
-  <w:footnote w:id="134">
+  <w:footnote w:id="140">
     <w:p>
       <w:pPr>
         <w:pStyle w:val="FootnoteText"/>
@@ -7733,7 +8185,7 @@
       </w:r>
     </w:p>
   </w:footnote>
-  <w:footnote w:id="135">
+  <w:footnote w:id="141">
     <w:p>
       <w:pPr>
         <w:pStyle w:val="FootnoteText"/>
@@ -7765,7 +8217,7 @@
       </w:r>
     </w:p>
   </w:footnote>
-  <w:footnote w:id="136">
+  <w:footnote w:id="142">
     <w:p>
       <w:pPr>
         <w:pStyle w:val="FootnoteText"/>
@@ -7797,7 +8249,7 @@
       </w:r>
     </w:p>
   </w:footnote>
-  <w:footnote w:id="137">
+  <w:footnote w:id="143">
     <w:p>
       <w:pPr>
         <w:pStyle w:val="FootnoteText"/>
@@ -7829,7 +8281,7 @@
       </w:r>
     </w:p>
   </w:footnote>
-  <w:footnote w:id="141">
+  <w:footnote w:id="147">
     <w:p>
       <w:pPr>
         <w:pStyle w:val="FootnoteText"/>
@@ -7861,7 +8313,7 @@
       </w:r>
     </w:p>
   </w:footnote>
-  <w:footnote w:id="142">
+  <w:footnote w:id="148">
     <w:p>
       <w:pPr>
         <w:pStyle w:val="FootnoteText"/>
@@ -7893,7 +8345,7 @@
       </w:r>
     </w:p>
   </w:footnote>
-  <w:footnote w:id="143">
+  <w:footnote w:id="149">
     <w:p>
       <w:pPr>
         <w:pStyle w:val="FootnoteText"/>
@@ -7925,7 +8377,7 @@
       </w:r>
     </w:p>
   </w:footnote>
-  <w:footnote w:id="144">
+  <w:footnote w:id="150">
     <w:p>
       <w:pPr>
         <w:pStyle w:val="FootnoteText"/>
@@ -7957,7 +8409,7 @@
       </w:r>
     </w:p>
   </w:footnote>
-  <w:footnote w:id="146">
+  <w:footnote w:id="152">
     <w:p>
       <w:pPr>
         <w:pStyle w:val="FootnoteText"/>
@@ -7989,7 +8441,7 @@
       </w:r>
     </w:p>
   </w:footnote>
-  <w:footnote w:id="147">
+  <w:footnote w:id="153">
     <w:p>
       <w:pPr>
         <w:pStyle w:val="FootnoteText"/>
@@ -8021,7 +8473,7 @@
       </w:r>
     </w:p>
   </w:footnote>
-  <w:footnote w:id="148">
+  <w:footnote w:id="154">
     <w:p>
       <w:pPr>
         <w:pStyle w:val="FootnoteText"/>
@@ -8053,7 +8505,7 @@
       </w:r>
     </w:p>
   </w:footnote>
-  <w:footnote w:id="149">
+  <w:footnote w:id="155">
     <w:p>
       <w:pPr>
         <w:pStyle w:val="FootnoteText"/>
@@ -8085,7 +8537,7 @@
       </w:r>
     </w:p>
   </w:footnote>
-  <w:footnote w:id="150">
+  <w:footnote w:id="156">
     <w:p>
       <w:pPr>
         <w:pStyle w:val="FootnoteText"/>
@@ -8117,7 +8569,7 @@
       </w:r>
     </w:p>
   </w:footnote>
-  <w:footnote w:id="151">
+  <w:footnote w:id="157">
     <w:p>
       <w:pPr>
         <w:pStyle w:val="FootnoteText"/>
@@ -8149,7 +8601,7 @@
       </w:r>
     </w:p>
   </w:footnote>
-  <w:footnote w:id="152">
+  <w:footnote w:id="158">
     <w:p>
       <w:pPr>
         <w:pStyle w:val="FootnoteText"/>
@@ -8181,7 +8633,7 @@
       </w:r>
     </w:p>
   </w:footnote>
-  <w:footnote w:id="153">
+  <w:footnote w:id="159">
     <w:p>
       <w:pPr>
         <w:pStyle w:val="FootnoteText"/>

</xml_diff>